<commit_message>
Lore primer overhaul: map on page 1, full illustrated gazetteer + Roads Not Yet Taken (7pp)
Co-Authored-By: Claude Opus 4.8 <noreply@anthropic.com>
</commit_message>
<xml_diff>
--- a/frontmatter/lore_primer.docx
+++ b/frontmatter/lore_primer.docx
@@ -72,6 +72,62 @@
           <w:sz w:val="19"/>
         </w:rPr>
         <w:t>The lore behind the chronicle: how the world is built, who threatens it, and what the Guardians are truly fighting for.</w:t>
+      </w:r>
+    </w:p>
+    <w:p>
+      <w:pPr>
+        <w:keepNext/>
+        <w:spacing w:before="120" w:after="40"/>
+        <w:jc w:val="center"/>
+      </w:pPr>
+      <w:r>
+        <w:drawing>
+          <wp:inline xmlns:a="http://schemas.openxmlformats.org/drawingml/2006/main" xmlns:pic="http://schemas.openxmlformats.org/drawingml/2006/picture">
+            <wp:extent cx="3840480" cy="3840480"/>
+            <wp:docPr id="1" name="Picture 1"/>
+            <wp:cNvGraphicFramePr>
+              <a:graphicFrameLocks noChangeAspect="1"/>
+            </wp:cNvGraphicFramePr>
+            <a:graphic>
+              <a:graphicData uri="http://schemas.openxmlformats.org/drawingml/2006/picture">
+                <pic:pic>
+                  <pic:nvPicPr>
+                    <pic:cNvPr id="0" name="image.jpg"/>
+                    <pic:cNvPicPr/>
+                  </pic:nvPicPr>
+                  <pic:blipFill>
+                    <a:blip r:embed="rId10"/>
+                    <a:stretch>
+                      <a:fillRect/>
+                    </a:stretch>
+                  </pic:blipFill>
+                  <pic:spPr>
+                    <a:xfrm>
+                      <a:off x="0" y="0"/>
+                      <a:ext cx="3840480" cy="3840480"/>
+                    </a:xfrm>
+                    <a:prstGeom prst="rect"/>
+                  </pic:spPr>
+                </pic:pic>
+              </a:graphicData>
+            </a:graphic>
+          </wp:inline>
+        </w:drawing>
+      </w:r>
+    </w:p>
+    <w:p>
+      <w:pPr>
+        <w:spacing w:after="140"/>
+        <w:jc w:val="center"/>
+      </w:pPr>
+      <w:r>
+        <w:rPr>
+          <w:rFonts w:ascii="Georgia" w:hAnsi="Georgia" w:cs="Georgia"/>
+          <w:i/>
+          <w:color w:val="888888"/>
+          <w:sz w:val="18"/>
+        </w:rPr>
+        <w:t>The lands of Elaria: Eldridge Vale, Oakshade Glade, the Ravenstone Cliffs, and Crystal Hollow, with the artificers' country in the southeast and the coast beyond.</w:t>
       </w:r>
     </w:p>
     <w:p>
@@ -470,62 +526,6 @@
     <w:p>
       <w:pPr>
         <w:keepNext/>
-        <w:spacing w:before="120" w:after="40"/>
-        <w:jc w:val="center"/>
-      </w:pPr>
-      <w:r>
-        <w:drawing>
-          <wp:inline xmlns:a="http://schemas.openxmlformats.org/drawingml/2006/main" xmlns:pic="http://schemas.openxmlformats.org/drawingml/2006/picture">
-            <wp:extent cx="3840480" cy="3840480"/>
-            <wp:docPr id="1" name="Picture 1"/>
-            <wp:cNvGraphicFramePr>
-              <a:graphicFrameLocks noChangeAspect="1"/>
-            </wp:cNvGraphicFramePr>
-            <a:graphic>
-              <a:graphicData uri="http://schemas.openxmlformats.org/drawingml/2006/picture">
-                <pic:pic>
-                  <pic:nvPicPr>
-                    <pic:cNvPr id="0" name="image.jpg"/>
-                    <pic:cNvPicPr/>
-                  </pic:nvPicPr>
-                  <pic:blipFill>
-                    <a:blip r:embed="rId10"/>
-                    <a:stretch>
-                      <a:fillRect/>
-                    </a:stretch>
-                  </pic:blipFill>
-                  <pic:spPr>
-                    <a:xfrm>
-                      <a:off x="0" y="0"/>
-                      <a:ext cx="3840480" cy="3840480"/>
-                    </a:xfrm>
-                    <a:prstGeom prst="rect"/>
-                  </pic:spPr>
-                </pic:pic>
-              </a:graphicData>
-            </a:graphic>
-          </wp:inline>
-        </w:drawing>
-      </w:r>
-    </w:p>
-    <w:p>
-      <w:pPr>
-        <w:spacing w:after="140"/>
-        <w:jc w:val="center"/>
-      </w:pPr>
-      <w:r>
-        <w:rPr>
-          <w:rFonts w:ascii="Georgia" w:hAnsi="Georgia" w:cs="Georgia"/>
-          <w:i/>
-          <w:color w:val="888888"/>
-          <w:sz w:val="18"/>
-        </w:rPr>
-        <w:t>The lands of Elaria, from Eldridge Vale in the west to the clockwork city of Gearhaven.</w:t>
-      </w:r>
-    </w:p>
-    <w:p>
-      <w:pPr>
-        <w:keepNext/>
         <w:spacing w:before="400" w:after="120"/>
         <w:pBdr>
           <w:bottom w:val="single" w:sz="6" w:space="4" w:color="B8860B"/>
@@ -807,7 +807,7 @@
           <w:color w:val="B8860B"/>
           <w:sz w:val="32"/>
         </w:rPr>
-        <w:t>A Gazetteer</w:t>
+        <w:t>A Gazetteer of Elaria</w:t>
       </w:r>
     </w:p>
     <w:p>
@@ -822,13 +822,84 @@
           <w:color w:val="222222"/>
           <w:sz w:val="21"/>
         </w:rPr>
-        <w:t>The chronicle's road, west to east:</w:t>
+        <w:t>The chronicle's road runs west to east, village by village, and every stop on it has left a mark on the Guardians (and they on it). Here is each place as the chronicle knows it, followed by the roads not yet taken.</w:t>
+      </w:r>
+    </w:p>
+    <w:p>
+      <w:pPr>
+        <w:keepNext/>
+        <w:spacing w:before="220" w:after="60"/>
+      </w:pPr>
+      <w:r>
+        <w:rPr>
+          <w:rFonts w:ascii="Georgia" w:hAnsi="Georgia" w:cs="Georgia"/>
+          <w:b/>
+          <w:color w:val="A0522D"/>
+          <w:sz w:val="26"/>
+        </w:rPr>
+        <w:t>Eldridge Village and the Forest of Whispers</w:t>
+      </w:r>
+    </w:p>
+    <w:p>
+      <w:pPr>
+        <w:spacing w:after="0" w:before="0"/>
+      </w:pPr>
+      <w:r>
+        <w:drawing>
+          <wp:anchor xmlns:a="http://schemas.openxmlformats.org/drawingml/2006/main" behindDoc="0" distT="0" distB="0" distL="114300" distR="0" simplePos="0" locked="0" layoutInCell="1" allowOverlap="1" relativeHeight="2">
+            <wp:simplePos x="0" y="0"/>
+            <wp:positionH relativeFrom="column">
+              <wp:align>right</wp:align>
+            </wp:positionH>
+            <wp:positionV relativeFrom="paragraph">
+              <wp:posOffset>0</wp:posOffset>
+            </wp:positionV>
+            <wp:extent cx="2286000" cy="2286000"/>
+            <wp:effectExtent l="0" t="0" r="0" b="0"/>
+            <wp:wrapSquare wrapText="bothSides"/>
+            <wp:docPr id="2" name="Picture 2"/>
+            <wp:cNvGraphicFramePr/>
+            <a:graphic xmlns:pic="http://schemas.openxmlformats.org/drawingml/2006/picture">
+              <a:graphicData uri="http://schemas.openxmlformats.org/drawingml/2006/picture">
+                <pic:pic>
+                  <pic:nvPicPr>
+                    <pic:cNvPr id="0" name="image.jpg"/>
+                    <pic:cNvPicPr/>
+                  </pic:nvPicPr>
+                  <pic:blipFill>
+                    <a:blip r:embed="rId11"/>
+                    <a:stretch>
+                      <a:fillRect/>
+                    </a:stretch>
+                  </pic:blipFill>
+                  <pic:spPr>
+                    <a:xfrm>
+                      <a:off x="0" y="0"/>
+                      <a:ext cx="2286000" cy="2286000"/>
+                    </a:xfrm>
+                    <a:prstGeom prst="rect"/>
+                  </pic:spPr>
+                </pic:pic>
+              </a:graphicData>
+            </a:graphic>
+          </wp:anchor>
+        </w:drawing>
       </w:r>
     </w:p>
     <w:p>
       <w:pPr>
         <w:spacing w:after="80"/>
       </w:pPr>
+      <w:r>
+        <w:rPr>
+          <w:rFonts w:ascii="Georgia" w:hAnsi="Georgia" w:cs="Georgia"/>
+          <w:b w:val="0"/>
+          <w:i w:val="0"/>
+          <w:color w:val="222222"/>
+          <w:sz w:val="21"/>
+        </w:rPr>
+        <w:t xml:space="preserve">A quaint village in the rolling hills of </w:t>
+      </w:r>
       <w:r>
         <w:rPr>
           <w:rFonts w:ascii="Georgia" w:hAnsi="Georgia" w:cs="Georgia"/>
@@ -847,7 +918,7 @@
           <w:color w:val="222222"/>
           <w:sz w:val="21"/>
         </w:rPr>
-        <w:t xml:space="preserve"> and the Forest of Whispers, where three strangers met. </w:t>
+        <w:t xml:space="preserve">, known for its bustling little marketplace, its seasonal festivals honoring Elaria, and the </w:t>
       </w:r>
       <w:r>
         <w:rPr>
@@ -857,7 +928,7 @@
           <w:color w:val="222222"/>
           <w:sz w:val="21"/>
         </w:rPr>
-        <w:t>Oakshade</w:t>
+        <w:t>Gilded Acorn Tavern</w:t>
       </w:r>
       <w:r>
         <w:rPr>
@@ -867,7 +938,7 @@
           <w:color w:val="222222"/>
           <w:sz w:val="21"/>
         </w:rPr>
-        <w:t xml:space="preserve"> and the cliffside </w:t>
+        <w:t xml:space="preserve">, the warm-hearted inn (Osric behind the bar, Rhea working the tables) where three young strangers first sat down at one table. Just beyond the fields waits the </w:t>
       </w:r>
       <w:r>
         <w:rPr>
@@ -877,7 +948,7 @@
           <w:color w:val="222222"/>
           <w:sz w:val="21"/>
         </w:rPr>
-        <w:t>Ravenstone Laboratory</w:t>
+        <w:t>Forest of Whispers</w:t>
       </w:r>
       <w:r>
         <w:rPr>
@@ -887,67 +958,7 @@
           <w:color w:val="222222"/>
           <w:sz w:val="21"/>
         </w:rPr>
-        <w:t xml:space="preserve"> of Professor Aelwyn. Wintry </w:t>
-      </w:r>
-      <w:r>
-        <w:rPr>
-          <w:rFonts w:ascii="Georgia" w:hAnsi="Georgia" w:cs="Georgia"/>
-          <w:b/>
-          <w:i w:val="0"/>
-          <w:color w:val="222222"/>
-          <w:sz w:val="21"/>
-        </w:rPr>
-        <w:t>Havenmoor</w:t>
-      </w:r>
-      <w:r>
-        <w:rPr>
-          <w:rFonts w:ascii="Georgia" w:hAnsi="Georgia" w:cs="Georgia"/>
-          <w:b w:val="0"/>
-          <w:i w:val="0"/>
-          <w:color w:val="222222"/>
-          <w:sz w:val="21"/>
-        </w:rPr>
-        <w:t xml:space="preserve"> on the coast, and the cursed sea beyond it. Fog-bound </w:t>
-      </w:r>
-      <w:r>
-        <w:rPr>
-          <w:rFonts w:ascii="Georgia" w:hAnsi="Georgia" w:cs="Georgia"/>
-          <w:b/>
-          <w:i w:val="0"/>
-          <w:color w:val="222222"/>
-          <w:sz w:val="21"/>
-        </w:rPr>
-        <w:t>Wraithpine</w:t>
-      </w:r>
-      <w:r>
-        <w:rPr>
-          <w:rFonts w:ascii="Georgia" w:hAnsi="Georgia" w:cs="Georgia"/>
-          <w:b w:val="0"/>
-          <w:i w:val="0"/>
-          <w:color w:val="222222"/>
-          <w:sz w:val="21"/>
-        </w:rPr>
-        <w:t xml:space="preserve"> and its old theater. And </w:t>
-      </w:r>
-      <w:r>
-        <w:rPr>
-          <w:rFonts w:ascii="Georgia" w:hAnsi="Georgia" w:cs="Georgia"/>
-          <w:b/>
-          <w:i w:val="0"/>
-          <w:color w:val="222222"/>
-          <w:sz w:val="21"/>
-        </w:rPr>
-        <w:t>Gearhaven</w:t>
-      </w:r>
-      <w:r>
-        <w:rPr>
-          <w:rFonts w:ascii="Georgia" w:hAnsi="Georgia" w:cs="Georgia"/>
-          <w:b w:val="0"/>
-          <w:i w:val="0"/>
-          <w:color w:val="222222"/>
-          <w:sz w:val="21"/>
-        </w:rPr>
-        <w:t>, the great clockwork city of inventors, home to the Artificer's Guild, the Orrery of Planes, and the Rift Portal that will carry the Guardians to the failing worlds beyond.</w:t>
+        <w:t>: ancient trees, hidden pathways, and a hush that is not quite silence, for the leaves seem to murmur with voices of the past.</w:t>
       </w:r>
     </w:p>
     <w:p>
@@ -962,7 +973,1720 @@
           <w:color w:val="222222"/>
           <w:sz w:val="21"/>
         </w:rPr>
-        <w:t>Farther still, unmapped and waiting: the old shrine to the east that Ash Catchum followed the dark stars toward, and the five rift-worlds the Guardians will one day walk to free their guardians and relight the sky.</w:t>
+        <w:t xml:space="preserve">Deep in the wood stand the mossy standing stones where the guardian </w:t>
+      </w:r>
+      <w:r>
+        <w:rPr>
+          <w:rFonts w:ascii="Georgia" w:hAnsi="Georgia" w:cs="Georgia"/>
+          <w:b/>
+          <w:i w:val="0"/>
+          <w:color w:val="222222"/>
+          <w:sz w:val="21"/>
+        </w:rPr>
+        <w:t>Duckleaf</w:t>
+      </w:r>
+      <w:r>
+        <w:rPr>
+          <w:rFonts w:ascii="Georgia" w:hAnsi="Georgia" w:cs="Georgia"/>
+          <w:b w:val="0"/>
+          <w:i w:val="0"/>
+          <w:color w:val="222222"/>
+          <w:sz w:val="21"/>
+        </w:rPr>
+        <w:t xml:space="preserve"> kept its post, drawing power from the Plane of Air, and beyond them the </w:t>
+      </w:r>
+      <w:r>
+        <w:rPr>
+          <w:rFonts w:ascii="Georgia" w:hAnsi="Georgia" w:cs="Georgia"/>
+          <w:b/>
+          <w:i w:val="0"/>
+          <w:color w:val="222222"/>
+          <w:sz w:val="21"/>
+        </w:rPr>
+        <w:t>Grove of Elemental Waters</w:t>
+      </w:r>
+      <w:r>
+        <w:rPr>
+          <w:rFonts w:ascii="Georgia" w:hAnsi="Georgia" w:cs="Georgia"/>
+          <w:b w:val="0"/>
+          <w:i w:val="0"/>
+          <w:color w:val="222222"/>
+          <w:sz w:val="21"/>
+        </w:rPr>
+        <w:t>, where the party first saw motes drifting loose like sparks from a cracked lantern. The quiet pond where Lickgloom was befriended lies here too. It was in this forest that the work of the Guardians truly began.</w:t>
+      </w:r>
+    </w:p>
+    <w:p>
+      <w:pPr>
+        <w:keepNext/>
+        <w:spacing w:before="220" w:after="60"/>
+      </w:pPr>
+      <w:r>
+        <w:rPr>
+          <w:rFonts w:ascii="Georgia" w:hAnsi="Georgia" w:cs="Georgia"/>
+          <w:b/>
+          <w:color w:val="A0522D"/>
+          <w:sz w:val="26"/>
+        </w:rPr>
+        <w:t>Oakshade Village</w:t>
+      </w:r>
+    </w:p>
+    <w:p>
+      <w:pPr>
+        <w:spacing w:after="0" w:before="0"/>
+      </w:pPr>
+      <w:r>
+        <w:drawing>
+          <wp:anchor xmlns:a="http://schemas.openxmlformats.org/drawingml/2006/main" behindDoc="0" distT="0" distB="0" distL="114300" distR="0" simplePos="0" locked="0" layoutInCell="1" allowOverlap="1" relativeHeight="2">
+            <wp:simplePos x="0" y="0"/>
+            <wp:positionH relativeFrom="column">
+              <wp:align>right</wp:align>
+            </wp:positionH>
+            <wp:positionV relativeFrom="paragraph">
+              <wp:posOffset>0</wp:posOffset>
+            </wp:positionV>
+            <wp:extent cx="2286000" cy="2286000"/>
+            <wp:effectExtent l="0" t="0" r="0" b="0"/>
+            <wp:wrapSquare wrapText="bothSides"/>
+            <wp:docPr id="3" name="Picture 3"/>
+            <wp:cNvGraphicFramePr/>
+            <a:graphic xmlns:pic="http://schemas.openxmlformats.org/drawingml/2006/picture">
+              <a:graphicData uri="http://schemas.openxmlformats.org/drawingml/2006/picture">
+                <pic:pic>
+                  <pic:nvPicPr>
+                    <pic:cNvPr id="0" name="image.jpg"/>
+                    <pic:cNvPicPr/>
+                  </pic:nvPicPr>
+                  <pic:blipFill>
+                    <a:blip r:embed="rId12"/>
+                    <a:stretch>
+                      <a:fillRect/>
+                    </a:stretch>
+                  </pic:blipFill>
+                  <pic:spPr>
+                    <a:xfrm>
+                      <a:off x="0" y="0"/>
+                      <a:ext cx="2286000" cy="2286000"/>
+                    </a:xfrm>
+                    <a:prstGeom prst="rect"/>
+                  </pic:spPr>
+                </pic:pic>
+              </a:graphicData>
+            </a:graphic>
+          </wp:anchor>
+        </w:drawing>
+      </w:r>
+    </w:p>
+    <w:p>
+      <w:pPr>
+        <w:spacing w:after="80"/>
+      </w:pPr>
+      <w:r>
+        <w:rPr>
+          <w:rFonts w:ascii="Georgia" w:hAnsi="Georgia" w:cs="Georgia"/>
+          <w:b w:val="0"/>
+          <w:i w:val="0"/>
+          <w:color w:val="222222"/>
+          <w:sz w:val="21"/>
+        </w:rPr>
+        <w:t xml:space="preserve">A small village in </w:t>
+      </w:r>
+      <w:r>
+        <w:rPr>
+          <w:rFonts w:ascii="Georgia" w:hAnsi="Georgia" w:cs="Georgia"/>
+          <w:b/>
+          <w:i w:val="0"/>
+          <w:color w:val="222222"/>
+          <w:sz w:val="21"/>
+        </w:rPr>
+        <w:t>Oakshade Glade</w:t>
+      </w:r>
+      <w:r>
+        <w:rPr>
+          <w:rFonts w:ascii="Georgia" w:hAnsi="Georgia" w:cs="Georgia"/>
+          <w:b w:val="0"/>
+          <w:i w:val="0"/>
+          <w:color w:val="222222"/>
+          <w:sz w:val="21"/>
+        </w:rPr>
+        <w:t xml:space="preserve">, shaded by oaks so old the villagers name them like elders. Oakshade has always been a place of druids and rangers, folk who keep the surrounding forests and mark the turning seasons, and it serves as the waypoint for anyone traveling on to Ravenstone. The </w:t>
+      </w:r>
+      <w:r>
+        <w:rPr>
+          <w:rFonts w:ascii="Georgia" w:hAnsi="Georgia" w:cs="Georgia"/>
+          <w:b/>
+          <w:i w:val="0"/>
+          <w:color w:val="222222"/>
+          <w:sz w:val="21"/>
+        </w:rPr>
+        <w:t>Old Oak Tavern</w:t>
+      </w:r>
+      <w:r>
+        <w:rPr>
+          <w:rFonts w:ascii="Georgia" w:hAnsi="Georgia" w:cs="Georgia"/>
+          <w:b w:val="0"/>
+          <w:i w:val="0"/>
+          <w:color w:val="222222"/>
+          <w:sz w:val="21"/>
+        </w:rPr>
+        <w:t xml:space="preserve"> (Alwen, proprietor) pours a famous mulled cider; Elder Merwin doubles as the blacksmith; Nina the herbalist knows every root and remedy in the glade.</w:t>
+      </w:r>
+    </w:p>
+    <w:p>
+      <w:pPr>
+        <w:spacing w:after="80"/>
+      </w:pPr>
+      <w:r>
+        <w:rPr>
+          <w:rFonts w:ascii="Georgia" w:hAnsi="Georgia" w:cs="Georgia"/>
+          <w:b w:val="0"/>
+          <w:i w:val="0"/>
+          <w:color w:val="222222"/>
+          <w:sz w:val="21"/>
+        </w:rPr>
+        <w:t>The Guardians came here chasing rumors and found trouble worth the trip: Mudskips boiling up out of the wet fields, a Grimfang goblin ambush on the road, and the hulking Terranox shaking the earth itself. Merwin's missing herb-gatherers came home dazed once the Mist Stalkers were dealt with, and Oakshade has counted the party as friends ever since.</w:t>
+      </w:r>
+    </w:p>
+    <w:p>
+      <w:pPr>
+        <w:keepNext/>
+        <w:spacing w:before="220" w:after="60"/>
+      </w:pPr>
+      <w:r>
+        <w:rPr>
+          <w:rFonts w:ascii="Georgia" w:hAnsi="Georgia" w:cs="Georgia"/>
+          <w:b/>
+          <w:color w:val="A0522D"/>
+          <w:sz w:val="26"/>
+        </w:rPr>
+        <w:t>The Whispering Glade</w:t>
+      </w:r>
+    </w:p>
+    <w:p>
+      <w:pPr>
+        <w:spacing w:after="0" w:before="0"/>
+      </w:pPr>
+      <w:r>
+        <w:drawing>
+          <wp:anchor xmlns:a="http://schemas.openxmlformats.org/drawingml/2006/main" behindDoc="0" distT="0" distB="0" distL="114300" distR="0" simplePos="0" locked="0" layoutInCell="1" allowOverlap="1" relativeHeight="2">
+            <wp:simplePos x="0" y="0"/>
+            <wp:positionH relativeFrom="column">
+              <wp:align>right</wp:align>
+            </wp:positionH>
+            <wp:positionV relativeFrom="paragraph">
+              <wp:posOffset>0</wp:posOffset>
+            </wp:positionV>
+            <wp:extent cx="2286000" cy="2286000"/>
+            <wp:effectExtent l="0" t="0" r="0" b="0"/>
+            <wp:wrapSquare wrapText="bothSides"/>
+            <wp:docPr id="4" name="Picture 4"/>
+            <wp:cNvGraphicFramePr/>
+            <a:graphic xmlns:pic="http://schemas.openxmlformats.org/drawingml/2006/picture">
+              <a:graphicData uri="http://schemas.openxmlformats.org/drawingml/2006/picture">
+                <pic:pic>
+                  <pic:nvPicPr>
+                    <pic:cNvPr id="0" name="image.jpg"/>
+                    <pic:cNvPicPr/>
+                  </pic:nvPicPr>
+                  <pic:blipFill>
+                    <a:blip r:embed="rId13"/>
+                    <a:stretch>
+                      <a:fillRect/>
+                    </a:stretch>
+                  </pic:blipFill>
+                  <pic:spPr>
+                    <a:xfrm>
+                      <a:off x="0" y="0"/>
+                      <a:ext cx="2286000" cy="2286000"/>
+                    </a:xfrm>
+                    <a:prstGeom prst="rect"/>
+                  </pic:spPr>
+                </pic:pic>
+              </a:graphicData>
+            </a:graphic>
+          </wp:anchor>
+        </w:drawing>
+      </w:r>
+    </w:p>
+    <w:p>
+      <w:pPr>
+        <w:spacing w:after="80"/>
+      </w:pPr>
+      <w:r>
+        <w:rPr>
+          <w:rFonts w:ascii="Georgia" w:hAnsi="Georgia" w:cs="Georgia"/>
+          <w:b w:val="0"/>
+          <w:i w:val="0"/>
+          <w:color w:val="222222"/>
+          <w:sz w:val="21"/>
+        </w:rPr>
+        <w:t xml:space="preserve">A ring of silver-barked trees off the Ravenstone road where the air goes still and starlight pools like water. Here, for the first time, </w:t>
+      </w:r>
+      <w:r>
+        <w:rPr>
+          <w:rFonts w:ascii="Georgia" w:hAnsi="Georgia" w:cs="Georgia"/>
+          <w:b/>
+          <w:i w:val="0"/>
+          <w:color w:val="222222"/>
+          <w:sz w:val="21"/>
+        </w:rPr>
+        <w:t>Elaria herself reached out</w:t>
+      </w:r>
+      <w:r>
+        <w:rPr>
+          <w:rFonts w:ascii="Georgia" w:hAnsi="Georgia" w:cs="Georgia"/>
+          <w:b w:val="0"/>
+          <w:i w:val="0"/>
+          <w:color w:val="222222"/>
+          <w:sz w:val="21"/>
+        </w:rPr>
+        <w:t>: a vision of the sleeping Warden, a warning of cracks between worlds, and a boon laid on each of the three travelers before the light let them go.</w:t>
+      </w:r>
+    </w:p>
+    <w:p>
+      <w:pPr>
+        <w:spacing w:after="80"/>
+      </w:pPr>
+      <w:r>
+        <w:rPr>
+          <w:rFonts w:ascii="Georgia" w:hAnsi="Georgia" w:cs="Georgia"/>
+          <w:b w:val="0"/>
+          <w:i w:val="0"/>
+          <w:color w:val="222222"/>
+          <w:sz w:val="21"/>
+        </w:rPr>
+        <w:t>The glade is the closest thing the campaign has to holy ground. The Circle of the Eternal Stars whispers that places like it are thin spots in the world's cloth, where a sleeping goddess can press a hand through. Those who camp there report kind dreams and wake to find their small hurts mended.</w:t>
+      </w:r>
+    </w:p>
+    <w:p>
+      <w:pPr>
+        <w:keepNext/>
+        <w:spacing w:before="220" w:after="60"/>
+      </w:pPr>
+      <w:r>
+        <w:rPr>
+          <w:rFonts w:ascii="Georgia" w:hAnsi="Georgia" w:cs="Georgia"/>
+          <w:b/>
+          <w:color w:val="A0522D"/>
+          <w:sz w:val="26"/>
+        </w:rPr>
+        <w:t>Ravenstone Laboratory and the Ravenstone Cliffs</w:t>
+      </w:r>
+    </w:p>
+    <w:p>
+      <w:pPr>
+        <w:spacing w:after="0" w:before="0"/>
+      </w:pPr>
+      <w:r>
+        <w:drawing>
+          <wp:anchor xmlns:a="http://schemas.openxmlformats.org/drawingml/2006/main" behindDoc="0" distT="0" distB="0" distL="114300" distR="0" simplePos="0" locked="0" layoutInCell="1" allowOverlap="1" relativeHeight="2">
+            <wp:simplePos x="0" y="0"/>
+            <wp:positionH relativeFrom="column">
+              <wp:align>right</wp:align>
+            </wp:positionH>
+            <wp:positionV relativeFrom="paragraph">
+              <wp:posOffset>0</wp:posOffset>
+            </wp:positionV>
+            <wp:extent cx="2286000" cy="2286000"/>
+            <wp:effectExtent l="0" t="0" r="0" b="0"/>
+            <wp:wrapSquare wrapText="bothSides"/>
+            <wp:docPr id="5" name="Picture 5"/>
+            <wp:cNvGraphicFramePr/>
+            <a:graphic xmlns:pic="http://schemas.openxmlformats.org/drawingml/2006/picture">
+              <a:graphicData uri="http://schemas.openxmlformats.org/drawingml/2006/picture">
+                <pic:pic>
+                  <pic:nvPicPr>
+                    <pic:cNvPr id="0" name="image.jpg"/>
+                    <pic:cNvPicPr/>
+                  </pic:nvPicPr>
+                  <pic:blipFill>
+                    <a:blip r:embed="rId14"/>
+                    <a:stretch>
+                      <a:fillRect/>
+                    </a:stretch>
+                  </pic:blipFill>
+                  <pic:spPr>
+                    <a:xfrm>
+                      <a:off x="0" y="0"/>
+                      <a:ext cx="2286000" cy="2286000"/>
+                    </a:xfrm>
+                    <a:prstGeom prst="rect"/>
+                  </pic:spPr>
+                </pic:pic>
+              </a:graphicData>
+            </a:graphic>
+          </wp:anchor>
+        </w:drawing>
+      </w:r>
+    </w:p>
+    <w:p>
+      <w:pPr>
+        <w:spacing w:after="80"/>
+      </w:pPr>
+      <w:r>
+        <w:rPr>
+          <w:rFonts w:ascii="Georgia" w:hAnsi="Georgia" w:cs="Georgia"/>
+          <w:b w:val="0"/>
+          <w:i w:val="0"/>
+          <w:color w:val="222222"/>
+          <w:sz w:val="21"/>
+        </w:rPr>
+        <w:t xml:space="preserve">An impressive structure built straight into the </w:t>
+      </w:r>
+      <w:r>
+        <w:rPr>
+          <w:rFonts w:ascii="Georgia" w:hAnsi="Georgia" w:cs="Georgia"/>
+          <w:b/>
+          <w:i w:val="0"/>
+          <w:color w:val="222222"/>
+          <w:sz w:val="21"/>
+        </w:rPr>
+        <w:t>Ravenstone Cliffs</w:t>
+      </w:r>
+      <w:r>
+        <w:rPr>
+          <w:rFonts w:ascii="Georgia" w:hAnsi="Georgia" w:cs="Georgia"/>
+          <w:b w:val="0"/>
+          <w:i w:val="0"/>
+          <w:color w:val="222222"/>
+          <w:sz w:val="21"/>
+        </w:rPr>
+        <w:t xml:space="preserve">, high above a shimmering lake. This is the home of </w:t>
+      </w:r>
+      <w:r>
+        <w:rPr>
+          <w:rFonts w:ascii="Georgia" w:hAnsi="Georgia" w:cs="Georgia"/>
+          <w:b/>
+          <w:i w:val="0"/>
+          <w:color w:val="222222"/>
+          <w:sz w:val="21"/>
+        </w:rPr>
+        <w:t>Professor Aelwyn Ravenstone</w:t>
+      </w:r>
+      <w:r>
+        <w:rPr>
+          <w:rFonts w:ascii="Georgia" w:hAnsi="Georgia" w:cs="Georgia"/>
+          <w:b w:val="0"/>
+          <w:i w:val="0"/>
+          <w:color w:val="222222"/>
+          <w:sz w:val="21"/>
+        </w:rPr>
+        <w:t>, tall silver-haired high elf and the region's great scholar of planar phenomena, and his patient half-elf assistant Tamsin. Inside it is all alchemical apparatus, enchanted instruments, and shelves of research on the magical creatures of the region.</w:t>
+      </w:r>
+    </w:p>
+    <w:p>
+      <w:pPr>
+        <w:spacing w:after="80"/>
+      </w:pPr>
+      <w:r>
+        <w:rPr>
+          <w:rFonts w:ascii="Georgia" w:hAnsi="Georgia" w:cs="Georgia"/>
+          <w:b w:val="0"/>
+          <w:i w:val="0"/>
+          <w:color w:val="222222"/>
+          <w:sz w:val="21"/>
+        </w:rPr>
+        <w:t xml:space="preserve">It was Aelwyn who first examined the Essence Sphere and pointed the party toward Gearhaven, and Aelwyn who offered them their first companion, three small creatures in three warm crates (they chose Floraburst, who would one day become Ghostbloom). </w:t>
+      </w:r>
+      <w:r>
+        <w:rPr>
+          <w:rFonts w:ascii="Georgia" w:hAnsi="Georgia" w:cs="Georgia"/>
+          <w:b/>
+          <w:i w:val="0"/>
+          <w:color w:val="222222"/>
+          <w:sz w:val="21"/>
+        </w:rPr>
+        <w:t>Lickgloom</w:t>
+      </w:r>
+      <w:r>
+        <w:rPr>
+          <w:rFonts w:ascii="Georgia" w:hAnsi="Georgia" w:cs="Georgia"/>
+          <w:b w:val="0"/>
+          <w:i w:val="0"/>
+          <w:color w:val="222222"/>
+          <w:sz w:val="21"/>
+        </w:rPr>
+        <w:t xml:space="preserve"> lives at the laboratory still, taste-testing everything the Professor will allow and some things he will not.</w:t>
+      </w:r>
+    </w:p>
+    <w:p>
+      <w:pPr>
+        <w:keepNext/>
+        <w:spacing w:before="220" w:after="60"/>
+      </w:pPr>
+      <w:r>
+        <w:rPr>
+          <w:rFonts w:ascii="Georgia" w:hAnsi="Georgia" w:cs="Georgia"/>
+          <w:b/>
+          <w:color w:val="A0522D"/>
+          <w:sz w:val="26"/>
+        </w:rPr>
+        <w:t>The Road South: Brambleshadow, Ironroot, and Stormwatch</w:t>
+      </w:r>
+    </w:p>
+    <w:p>
+      <w:pPr>
+        <w:spacing w:after="0" w:before="0"/>
+      </w:pPr>
+      <w:r>
+        <w:drawing>
+          <wp:anchor xmlns:a="http://schemas.openxmlformats.org/drawingml/2006/main" behindDoc="0" distT="0" distB="0" distL="114300" distR="0" simplePos="0" locked="0" layoutInCell="1" allowOverlap="1" relativeHeight="2">
+            <wp:simplePos x="0" y="0"/>
+            <wp:positionH relativeFrom="column">
+              <wp:align>right</wp:align>
+            </wp:positionH>
+            <wp:positionV relativeFrom="paragraph">
+              <wp:posOffset>0</wp:posOffset>
+            </wp:positionV>
+            <wp:extent cx="2286000" cy="2286000"/>
+            <wp:effectExtent l="0" t="0" r="0" b="0"/>
+            <wp:wrapSquare wrapText="bothSides"/>
+            <wp:docPr id="6" name="Picture 6"/>
+            <wp:cNvGraphicFramePr/>
+            <a:graphic xmlns:pic="http://schemas.openxmlformats.org/drawingml/2006/picture">
+              <a:graphicData uri="http://schemas.openxmlformats.org/drawingml/2006/picture">
+                <pic:pic>
+                  <pic:nvPicPr>
+                    <pic:cNvPr id="0" name="image.jpg"/>
+                    <pic:cNvPicPr/>
+                  </pic:nvPicPr>
+                  <pic:blipFill>
+                    <a:blip r:embed="rId15"/>
+                    <a:stretch>
+                      <a:fillRect/>
+                    </a:stretch>
+                  </pic:blipFill>
+                  <pic:spPr>
+                    <a:xfrm>
+                      <a:off x="0" y="0"/>
+                      <a:ext cx="2286000" cy="2286000"/>
+                    </a:xfrm>
+                    <a:prstGeom prst="rect"/>
+                  </pic:spPr>
+                </pic:pic>
+              </a:graphicData>
+            </a:graphic>
+          </wp:anchor>
+        </w:drawing>
+      </w:r>
+    </w:p>
+    <w:p>
+      <w:pPr>
+        <w:spacing w:after="80"/>
+      </w:pPr>
+      <w:r>
+        <w:rPr>
+          <w:rFonts w:ascii="Georgia" w:hAnsi="Georgia" w:cs="Georgia"/>
+          <w:b w:val="0"/>
+          <w:i w:val="0"/>
+          <w:color w:val="222222"/>
+          <w:sz w:val="21"/>
+        </w:rPr>
+        <w:t xml:space="preserve">The long road from the cliffs down to the coast crosses wilder country: the tangled </w:t>
+      </w:r>
+      <w:r>
+        <w:rPr>
+          <w:rFonts w:ascii="Georgia" w:hAnsi="Georgia" w:cs="Georgia"/>
+          <w:b/>
+          <w:i w:val="0"/>
+          <w:color w:val="222222"/>
+          <w:sz w:val="21"/>
+        </w:rPr>
+        <w:t>Brambleshadow Thicket</w:t>
+      </w:r>
+      <w:r>
+        <w:rPr>
+          <w:rFonts w:ascii="Georgia" w:hAnsi="Georgia" w:cs="Georgia"/>
+          <w:b w:val="0"/>
+          <w:i w:val="0"/>
+          <w:color w:val="222222"/>
+          <w:sz w:val="21"/>
+        </w:rPr>
+        <w:t xml:space="preserve">, where a Shadowflame stalked the party through the thorns; </w:t>
+      </w:r>
+      <w:r>
+        <w:rPr>
+          <w:rFonts w:ascii="Georgia" w:hAnsi="Georgia" w:cs="Georgia"/>
+          <w:b/>
+          <w:i w:val="0"/>
+          <w:color w:val="222222"/>
+          <w:sz w:val="21"/>
+        </w:rPr>
+        <w:t>Whisperwind Meadow</w:t>
+      </w:r>
+      <w:r>
+        <w:rPr>
+          <w:rFonts w:ascii="Georgia" w:hAnsi="Georgia" w:cs="Georgia"/>
+          <w:b w:val="0"/>
+          <w:i w:val="0"/>
+          <w:color w:val="222222"/>
+          <w:sz w:val="21"/>
+        </w:rPr>
+        <w:t xml:space="preserve"> and the fog-hung </w:t>
+      </w:r>
+      <w:r>
+        <w:rPr>
+          <w:rFonts w:ascii="Georgia" w:hAnsi="Georgia" w:cs="Georgia"/>
+          <w:b/>
+          <w:i w:val="0"/>
+          <w:color w:val="222222"/>
+          <w:sz w:val="21"/>
+        </w:rPr>
+        <w:t>Mistwood Path</w:t>
+      </w:r>
+      <w:r>
+        <w:rPr>
+          <w:rFonts w:ascii="Georgia" w:hAnsi="Georgia" w:cs="Georgia"/>
+          <w:b w:val="0"/>
+          <w:i w:val="0"/>
+          <w:color w:val="222222"/>
+          <w:sz w:val="21"/>
+        </w:rPr>
+        <w:t xml:space="preserve">; the stony </w:t>
+      </w:r>
+      <w:r>
+        <w:rPr>
+          <w:rFonts w:ascii="Georgia" w:hAnsi="Georgia" w:cs="Georgia"/>
+          <w:b/>
+          <w:i w:val="0"/>
+          <w:color w:val="222222"/>
+          <w:sz w:val="21"/>
+        </w:rPr>
+        <w:t>Ironroot Hills</w:t>
+      </w:r>
+      <w:r>
+        <w:rPr>
+          <w:rFonts w:ascii="Georgia" w:hAnsi="Georgia" w:cs="Georgia"/>
+          <w:b w:val="0"/>
+          <w:i w:val="0"/>
+          <w:color w:val="222222"/>
+          <w:sz w:val="21"/>
+        </w:rPr>
+        <w:t>, hunting ground of displacer beasts and the strange singing Shroomyte groves.</w:t>
+      </w:r>
+    </w:p>
+    <w:p>
+      <w:pPr>
+        <w:spacing w:after="80"/>
+      </w:pPr>
+      <w:r>
+        <w:rPr>
+          <w:rFonts w:ascii="Georgia" w:hAnsi="Georgia" w:cs="Georgia"/>
+          <w:b w:val="0"/>
+          <w:i w:val="0"/>
+          <w:color w:val="222222"/>
+          <w:sz w:val="21"/>
+        </w:rPr>
+        <w:t xml:space="preserve">The road ends at </w:t>
+      </w:r>
+      <w:r>
+        <w:rPr>
+          <w:rFonts w:ascii="Georgia" w:hAnsi="Georgia" w:cs="Georgia"/>
+          <w:b/>
+          <w:i w:val="0"/>
+          <w:color w:val="222222"/>
+          <w:sz w:val="21"/>
+        </w:rPr>
+        <w:t>Stormwatch Cliffs</w:t>
+      </w:r>
+      <w:r>
+        <w:rPr>
+          <w:rFonts w:ascii="Georgia" w:hAnsi="Georgia" w:cs="Georgia"/>
+          <w:b w:val="0"/>
+          <w:i w:val="0"/>
+          <w:color w:val="222222"/>
+          <w:sz w:val="21"/>
+        </w:rPr>
+        <w:t xml:space="preserve">, where an old puzzle of standing stones guards the headland. There the Guardians saw him first: a </w:t>
+      </w:r>
+      <w:r>
+        <w:rPr>
+          <w:rFonts w:ascii="Georgia" w:hAnsi="Georgia" w:cs="Georgia"/>
+          <w:b/>
+          <w:i w:val="0"/>
+          <w:color w:val="222222"/>
+          <w:sz w:val="21"/>
+        </w:rPr>
+        <w:t>Dark Figure</w:t>
+      </w:r>
+      <w:r>
+        <w:rPr>
+          <w:rFonts w:ascii="Georgia" w:hAnsi="Georgia" w:cs="Georgia"/>
+          <w:b w:val="0"/>
+          <w:i w:val="0"/>
+          <w:color w:val="222222"/>
+          <w:sz w:val="21"/>
+        </w:rPr>
+        <w:t xml:space="preserve"> wrapped in shadow, glimpsed in vision above a fractured world, holding a dying star in one hand. They did not know his name then. The chronicle does now, and it is written a few pages back.</w:t>
+      </w:r>
+    </w:p>
+    <w:p>
+      <w:pPr>
+        <w:keepNext/>
+        <w:spacing w:before="220" w:after="60"/>
+      </w:pPr>
+      <w:r>
+        <w:rPr>
+          <w:rFonts w:ascii="Georgia" w:hAnsi="Georgia" w:cs="Georgia"/>
+          <w:b/>
+          <w:color w:val="A0522D"/>
+          <w:sz w:val="26"/>
+        </w:rPr>
+        <w:t>Havenmoor</w:t>
+      </w:r>
+    </w:p>
+    <w:p>
+      <w:pPr>
+        <w:spacing w:after="0" w:before="0"/>
+      </w:pPr>
+      <w:r>
+        <w:drawing>
+          <wp:anchor xmlns:a="http://schemas.openxmlformats.org/drawingml/2006/main" behindDoc="0" distT="0" distB="0" distL="114300" distR="0" simplePos="0" locked="0" layoutInCell="1" allowOverlap="1" relativeHeight="2">
+            <wp:simplePos x="0" y="0"/>
+            <wp:positionH relativeFrom="column">
+              <wp:align>right</wp:align>
+            </wp:positionH>
+            <wp:positionV relativeFrom="paragraph">
+              <wp:posOffset>0</wp:posOffset>
+            </wp:positionV>
+            <wp:extent cx="2286000" cy="2286000"/>
+            <wp:effectExtent l="0" t="0" r="0" b="0"/>
+            <wp:wrapSquare wrapText="bothSides"/>
+            <wp:docPr id="7" name="Picture 7"/>
+            <wp:cNvGraphicFramePr/>
+            <a:graphic xmlns:pic="http://schemas.openxmlformats.org/drawingml/2006/picture">
+              <a:graphicData uri="http://schemas.openxmlformats.org/drawingml/2006/picture">
+                <pic:pic>
+                  <pic:nvPicPr>
+                    <pic:cNvPr id="0" name="image.jpg"/>
+                    <pic:cNvPicPr/>
+                  </pic:nvPicPr>
+                  <pic:blipFill>
+                    <a:blip r:embed="rId16"/>
+                    <a:stretch>
+                      <a:fillRect/>
+                    </a:stretch>
+                  </pic:blipFill>
+                  <pic:spPr>
+                    <a:xfrm>
+                      <a:off x="0" y="0"/>
+                      <a:ext cx="2286000" cy="2286000"/>
+                    </a:xfrm>
+                    <a:prstGeom prst="rect"/>
+                  </pic:spPr>
+                </pic:pic>
+              </a:graphicData>
+            </a:graphic>
+          </wp:anchor>
+        </w:drawing>
+      </w:r>
+    </w:p>
+    <w:p>
+      <w:pPr>
+        <w:spacing w:after="80"/>
+      </w:pPr>
+      <w:r>
+        <w:rPr>
+          <w:rFonts w:ascii="Georgia" w:hAnsi="Georgia" w:cs="Georgia"/>
+          <w:b w:val="0"/>
+          <w:i w:val="0"/>
+          <w:color w:val="222222"/>
+          <w:sz w:val="21"/>
+        </w:rPr>
+        <w:t xml:space="preserve">A wintry harbor town on the southern coast, all snow-dusted roofs, ships' bells, and chimney smoke. Its landmarks are dear to the party: the </w:t>
+      </w:r>
+      <w:r>
+        <w:rPr>
+          <w:rFonts w:ascii="Georgia" w:hAnsi="Georgia" w:cs="Georgia"/>
+          <w:b/>
+          <w:i w:val="0"/>
+          <w:color w:val="222222"/>
+          <w:sz w:val="21"/>
+        </w:rPr>
+        <w:t>Sugarplum Hearth</w:t>
+      </w:r>
+      <w:r>
+        <w:rPr>
+          <w:rFonts w:ascii="Georgia" w:hAnsi="Georgia" w:cs="Georgia"/>
+          <w:b w:val="0"/>
+          <w:i w:val="0"/>
+          <w:color w:val="222222"/>
+          <w:sz w:val="21"/>
+        </w:rPr>
+        <w:t xml:space="preserve"> inn (Greta Frostbough's cocoa is a house rule unto itself), the </w:t>
+      </w:r>
+      <w:r>
+        <w:rPr>
+          <w:rFonts w:ascii="Georgia" w:hAnsi="Georgia" w:cs="Georgia"/>
+          <w:b/>
+          <w:i w:val="0"/>
+          <w:color w:val="222222"/>
+          <w:sz w:val="21"/>
+        </w:rPr>
+        <w:t>Frostwind Market Square</w:t>
+      </w:r>
+      <w:r>
+        <w:rPr>
+          <w:rFonts w:ascii="Georgia" w:hAnsi="Georgia" w:cs="Georgia"/>
+          <w:b w:val="0"/>
+          <w:i w:val="0"/>
+          <w:color w:val="222222"/>
+          <w:sz w:val="21"/>
+        </w:rPr>
+        <w:t xml:space="preserve">, the </w:t>
+      </w:r>
+      <w:r>
+        <w:rPr>
+          <w:rFonts w:ascii="Georgia" w:hAnsi="Georgia" w:cs="Georgia"/>
+          <w:b/>
+          <w:i w:val="0"/>
+          <w:color w:val="222222"/>
+          <w:sz w:val="21"/>
+        </w:rPr>
+        <w:t>Hollow Hearth Orphanage</w:t>
+      </w:r>
+      <w:r>
+        <w:rPr>
+          <w:rFonts w:ascii="Georgia" w:hAnsi="Georgia" w:cs="Georgia"/>
+          <w:b w:val="0"/>
+          <w:i w:val="0"/>
+          <w:color w:val="222222"/>
+          <w:sz w:val="21"/>
+        </w:rPr>
+        <w:t xml:space="preserve"> kept by Sister Merida, Master Doran Bramblebeard's shipyard, and the </w:t>
+      </w:r>
+      <w:r>
+        <w:rPr>
+          <w:rFonts w:ascii="Georgia" w:hAnsi="Georgia" w:cs="Georgia"/>
+          <w:b/>
+          <w:i w:val="0"/>
+          <w:color w:val="222222"/>
+          <w:sz w:val="21"/>
+        </w:rPr>
+        <w:t>Wyrmgale Lighthouse</w:t>
+      </w:r>
+      <w:r>
+        <w:rPr>
+          <w:rFonts w:ascii="Georgia" w:hAnsi="Georgia" w:cs="Georgia"/>
+          <w:b w:val="0"/>
+          <w:i w:val="0"/>
+          <w:color w:val="222222"/>
+          <w:sz w:val="21"/>
+        </w:rPr>
+        <w:t xml:space="preserve"> he tends on the point. A small </w:t>
+      </w:r>
+      <w:r>
+        <w:rPr>
+          <w:rFonts w:ascii="Georgia" w:hAnsi="Georgia" w:cs="Georgia"/>
+          <w:b/>
+          <w:i w:val="0"/>
+          <w:color w:val="222222"/>
+          <w:sz w:val="21"/>
+        </w:rPr>
+        <w:t>Shrine of Elaria</w:t>
+      </w:r>
+      <w:r>
+        <w:rPr>
+          <w:rFonts w:ascii="Georgia" w:hAnsi="Georgia" w:cs="Georgia"/>
+          <w:b w:val="0"/>
+          <w:i w:val="0"/>
+          <w:color w:val="222222"/>
+          <w:sz w:val="21"/>
+        </w:rPr>
+        <w:t xml:space="preserve"> stands quiet at the town's edge, still unvisited.</w:t>
+      </w:r>
+    </w:p>
+    <w:p>
+      <w:pPr>
+        <w:spacing w:after="80"/>
+      </w:pPr>
+      <w:r>
+        <w:rPr>
+          <w:rFonts w:ascii="Georgia" w:hAnsi="Georgia" w:cs="Georgia"/>
+          <w:b w:val="0"/>
+          <w:i w:val="0"/>
+          <w:color w:val="222222"/>
+          <w:sz w:val="21"/>
+        </w:rPr>
+        <w:t xml:space="preserve">Havenmoor is where the Guardians became heroes in the eyes of ordinary folk: when the </w:t>
+      </w:r>
+      <w:r>
+        <w:rPr>
+          <w:rFonts w:ascii="Georgia" w:hAnsi="Georgia" w:cs="Georgia"/>
+          <w:b/>
+          <w:i w:val="0"/>
+          <w:color w:val="222222"/>
+          <w:sz w:val="21"/>
+        </w:rPr>
+        <w:t>Krampusshade</w:t>
+      </w:r>
+      <w:r>
+        <w:rPr>
+          <w:rFonts w:ascii="Georgia" w:hAnsi="Georgia" w:cs="Georgia"/>
+          <w:b w:val="0"/>
+          <w:i w:val="0"/>
+          <w:color w:val="222222"/>
+          <w:sz w:val="21"/>
+        </w:rPr>
+        <w:t xml:space="preserve"> stole the town's children, the party rang the eight Winter Bells, broke the three barriers, and sang the monster back into the dark. The lorekeeper Faelan sent them onward with three gifts that they carry to this day.</w:t>
+      </w:r>
+    </w:p>
+    <w:p>
+      <w:pPr>
+        <w:keepNext/>
+        <w:spacing w:before="220" w:after="60"/>
+      </w:pPr>
+      <w:r>
+        <w:rPr>
+          <w:rFonts w:ascii="Georgia" w:hAnsi="Georgia" w:cs="Georgia"/>
+          <w:b/>
+          <w:color w:val="A0522D"/>
+          <w:sz w:val="26"/>
+        </w:rPr>
+        <w:t>The Open Sea and the Flying Dutchman</w:t>
+      </w:r>
+    </w:p>
+    <w:p>
+      <w:pPr>
+        <w:spacing w:after="0" w:before="0"/>
+      </w:pPr>
+      <w:r>
+        <w:drawing>
+          <wp:anchor xmlns:a="http://schemas.openxmlformats.org/drawingml/2006/main" behindDoc="0" distT="0" distB="0" distL="114300" distR="0" simplePos="0" locked="0" layoutInCell="1" allowOverlap="1" relativeHeight="2">
+            <wp:simplePos x="0" y="0"/>
+            <wp:positionH relativeFrom="column">
+              <wp:align>right</wp:align>
+            </wp:positionH>
+            <wp:positionV relativeFrom="paragraph">
+              <wp:posOffset>0</wp:posOffset>
+            </wp:positionV>
+            <wp:extent cx="2286000" cy="2286000"/>
+            <wp:effectExtent l="0" t="0" r="0" b="0"/>
+            <wp:wrapSquare wrapText="bothSides"/>
+            <wp:docPr id="8" name="Picture 8"/>
+            <wp:cNvGraphicFramePr/>
+            <a:graphic xmlns:pic="http://schemas.openxmlformats.org/drawingml/2006/picture">
+              <a:graphicData uri="http://schemas.openxmlformats.org/drawingml/2006/picture">
+                <pic:pic>
+                  <pic:nvPicPr>
+                    <pic:cNvPr id="0" name="image.jpg"/>
+                    <pic:cNvPicPr/>
+                  </pic:nvPicPr>
+                  <pic:blipFill>
+                    <a:blip r:embed="rId17"/>
+                    <a:stretch>
+                      <a:fillRect/>
+                    </a:stretch>
+                  </pic:blipFill>
+                  <pic:spPr>
+                    <a:xfrm>
+                      <a:off x="0" y="0"/>
+                      <a:ext cx="2286000" cy="2286000"/>
+                    </a:xfrm>
+                    <a:prstGeom prst="rect"/>
+                  </pic:spPr>
+                </pic:pic>
+              </a:graphicData>
+            </a:graphic>
+          </wp:anchor>
+        </w:drawing>
+      </w:r>
+    </w:p>
+    <w:p>
+      <w:pPr>
+        <w:spacing w:after="80"/>
+      </w:pPr>
+      <w:r>
+        <w:rPr>
+          <w:rFonts w:ascii="Georgia" w:hAnsi="Georgia" w:cs="Georgia"/>
+          <w:b w:val="0"/>
+          <w:i w:val="0"/>
+          <w:color w:val="222222"/>
+          <w:sz w:val="21"/>
+        </w:rPr>
+        <w:t xml:space="preserve">East of Havenmoor the coast gives way to deep water, and the deep water kept a curse. The party sailed with Captain Brynn Wavewarden aboard the </w:t>
+      </w:r>
+      <w:r>
+        <w:rPr>
+          <w:rFonts w:ascii="Georgia" w:hAnsi="Georgia" w:cs="Georgia"/>
+          <w:b/>
+          <w:i w:val="0"/>
+          <w:color w:val="222222"/>
+          <w:sz w:val="21"/>
+        </w:rPr>
+        <w:t>Stormwind</w:t>
+      </w:r>
+      <w:r>
+        <w:rPr>
+          <w:rFonts w:ascii="Georgia" w:hAnsi="Georgia" w:cs="Georgia"/>
+          <w:b w:val="0"/>
+          <w:i w:val="0"/>
+          <w:color w:val="222222"/>
+          <w:sz w:val="21"/>
+        </w:rPr>
+        <w:t xml:space="preserve">, which the storm took to the bottom; from the wreck they were dragged aboard the </w:t>
+      </w:r>
+      <w:r>
+        <w:rPr>
+          <w:rFonts w:ascii="Georgia" w:hAnsi="Georgia" w:cs="Georgia"/>
+          <w:b/>
+          <w:i w:val="0"/>
+          <w:color w:val="222222"/>
+          <w:sz w:val="21"/>
+        </w:rPr>
+        <w:t>Flying Dutchman</w:t>
+      </w:r>
+      <w:r>
+        <w:rPr>
+          <w:rFonts w:ascii="Georgia" w:hAnsi="Georgia" w:cs="Georgia"/>
+          <w:b w:val="0"/>
+          <w:i w:val="0"/>
+          <w:color w:val="222222"/>
+          <w:sz w:val="21"/>
+        </w:rPr>
+        <w:t xml:space="preserve">, the ghost ship of </w:t>
+      </w:r>
+      <w:r>
+        <w:rPr>
+          <w:rFonts w:ascii="Georgia" w:hAnsi="Georgia" w:cs="Georgia"/>
+          <w:b/>
+          <w:i w:val="0"/>
+          <w:color w:val="222222"/>
+          <w:sz w:val="21"/>
+        </w:rPr>
+        <w:t>Davy Jones</w:t>
+      </w:r>
+      <w:r>
+        <w:rPr>
+          <w:rFonts w:ascii="Georgia" w:hAnsi="Georgia" w:cs="Georgia"/>
+          <w:b w:val="0"/>
+          <w:i w:val="0"/>
+          <w:color w:val="222222"/>
+          <w:sz w:val="21"/>
+        </w:rPr>
+        <w:t xml:space="preserve"> himself.</w:t>
+      </w:r>
+    </w:p>
+    <w:p>
+      <w:pPr>
+        <w:spacing w:after="80"/>
+      </w:pPr>
+      <w:r>
+        <w:rPr>
+          <w:rFonts w:ascii="Georgia" w:hAnsi="Georgia" w:cs="Georgia"/>
+          <w:b w:val="0"/>
+          <w:i w:val="0"/>
+          <w:color w:val="222222"/>
+          <w:sz w:val="21"/>
+        </w:rPr>
+        <w:t>Below its decks they found something worse than ghosts: a harvest operation, spectral essences packed in crates stamped with an Artificers' Guild seal, bound south for buyers unknown. Davy Jones was destroyed at his own dice table, his crew freed, and the Dutchman finally allowed to sink. The Ghost essence Lilly drew from its hold began Floraburst's slow change into Ghostbloom. The sea is quiet now. The question of those crates is not.</w:t>
+      </w:r>
+    </w:p>
+    <w:p>
+      <w:pPr>
+        <w:keepNext/>
+        <w:spacing w:before="220" w:after="60"/>
+      </w:pPr>
+      <w:r>
+        <w:rPr>
+          <w:rFonts w:ascii="Georgia" w:hAnsi="Georgia" w:cs="Georgia"/>
+          <w:b/>
+          <w:color w:val="A0522D"/>
+          <w:sz w:val="26"/>
+        </w:rPr>
+        <w:t>Wraithpine and the Old Theater</w:t>
+      </w:r>
+    </w:p>
+    <w:p>
+      <w:pPr>
+        <w:spacing w:after="0" w:before="0"/>
+      </w:pPr>
+      <w:r>
+        <w:drawing>
+          <wp:anchor xmlns:a="http://schemas.openxmlformats.org/drawingml/2006/main" behindDoc="0" distT="0" distB="0" distL="114300" distR="0" simplePos="0" locked="0" layoutInCell="1" allowOverlap="1" relativeHeight="2">
+            <wp:simplePos x="0" y="0"/>
+            <wp:positionH relativeFrom="column">
+              <wp:align>right</wp:align>
+            </wp:positionH>
+            <wp:positionV relativeFrom="paragraph">
+              <wp:posOffset>0</wp:posOffset>
+            </wp:positionV>
+            <wp:extent cx="2286000" cy="2286000"/>
+            <wp:effectExtent l="0" t="0" r="0" b="0"/>
+            <wp:wrapSquare wrapText="bothSides"/>
+            <wp:docPr id="9" name="Picture 9"/>
+            <wp:cNvGraphicFramePr/>
+            <a:graphic xmlns:pic="http://schemas.openxmlformats.org/drawingml/2006/picture">
+              <a:graphicData uri="http://schemas.openxmlformats.org/drawingml/2006/picture">
+                <pic:pic>
+                  <pic:nvPicPr>
+                    <pic:cNvPr id="0" name="image.jpg"/>
+                    <pic:cNvPicPr/>
+                  </pic:nvPicPr>
+                  <pic:blipFill>
+                    <a:blip r:embed="rId18"/>
+                    <a:stretch>
+                      <a:fillRect/>
+                    </a:stretch>
+                  </pic:blipFill>
+                  <pic:spPr>
+                    <a:xfrm>
+                      <a:off x="0" y="0"/>
+                      <a:ext cx="2286000" cy="2286000"/>
+                    </a:xfrm>
+                    <a:prstGeom prst="rect"/>
+                  </pic:spPr>
+                </pic:pic>
+              </a:graphicData>
+            </a:graphic>
+          </wp:anchor>
+        </w:drawing>
+      </w:r>
+    </w:p>
+    <w:p>
+      <w:pPr>
+        <w:spacing w:after="80"/>
+      </w:pPr>
+      <w:r>
+        <w:rPr>
+          <w:rFonts w:ascii="Georgia" w:hAnsi="Georgia" w:cs="Georgia"/>
+          <w:b w:val="0"/>
+          <w:i w:val="0"/>
+          <w:color w:val="222222"/>
+          <w:sz w:val="21"/>
+        </w:rPr>
+        <w:t xml:space="preserve">A fog-bound village of carved pumpkins, swaying lanterns, and streets with names like </w:t>
+      </w:r>
+      <w:r>
+        <w:rPr>
+          <w:rFonts w:ascii="Georgia" w:hAnsi="Georgia" w:cs="Georgia"/>
+          <w:b/>
+          <w:i w:val="0"/>
+          <w:color w:val="222222"/>
+          <w:sz w:val="21"/>
+        </w:rPr>
+        <w:t>Pumpkin Row</w:t>
+      </w:r>
+      <w:r>
+        <w:rPr>
+          <w:rFonts w:ascii="Georgia" w:hAnsi="Georgia" w:cs="Georgia"/>
+          <w:b w:val="0"/>
+          <w:i w:val="0"/>
+          <w:color w:val="222222"/>
+          <w:sz w:val="21"/>
+        </w:rPr>
+        <w:t xml:space="preserve"> and </w:t>
+      </w:r>
+      <w:r>
+        <w:rPr>
+          <w:rFonts w:ascii="Georgia" w:hAnsi="Georgia" w:cs="Georgia"/>
+          <w:b/>
+          <w:i w:val="0"/>
+          <w:color w:val="222222"/>
+          <w:sz w:val="21"/>
+        </w:rPr>
+        <w:t>Lantern Lane</w:t>
+      </w:r>
+      <w:r>
+        <w:rPr>
+          <w:rFonts w:ascii="Georgia" w:hAnsi="Georgia" w:cs="Georgia"/>
+          <w:b w:val="0"/>
+          <w:i w:val="0"/>
+          <w:color w:val="222222"/>
+          <w:sz w:val="21"/>
+        </w:rPr>
+        <w:t xml:space="preserve">, watched over by the belltower quarter called Bellshadow. The </w:t>
+      </w:r>
+      <w:r>
+        <w:rPr>
+          <w:rFonts w:ascii="Georgia" w:hAnsi="Georgia" w:cs="Georgia"/>
+          <w:b/>
+          <w:i w:val="0"/>
+          <w:color w:val="222222"/>
+          <w:sz w:val="21"/>
+        </w:rPr>
+        <w:t>Gasping Gull</w:t>
+      </w:r>
+      <w:r>
+        <w:rPr>
+          <w:rFonts w:ascii="Georgia" w:hAnsi="Georgia" w:cs="Georgia"/>
+          <w:b w:val="0"/>
+          <w:i w:val="0"/>
+          <w:color w:val="222222"/>
+          <w:sz w:val="21"/>
+        </w:rPr>
+        <w:t xml:space="preserve"> inn (Maera, proprietor) sits on the cobbled square. Wraithpine looks like a festival that never ends, and for a while that was the kindest thing about it: a </w:t>
+      </w:r>
+      <w:r>
+        <w:rPr>
+          <w:rFonts w:ascii="Georgia" w:hAnsi="Georgia" w:cs="Georgia"/>
+          <w:b/>
+          <w:i w:val="0"/>
+          <w:color w:val="222222"/>
+          <w:sz w:val="21"/>
+        </w:rPr>
+        <w:t>False Hydra</w:t>
+      </w:r>
+      <w:r>
+        <w:rPr>
+          <w:rFonts w:ascii="Georgia" w:hAnsi="Georgia" w:cs="Georgia"/>
+          <w:b w:val="0"/>
+          <w:i w:val="0"/>
+          <w:color w:val="222222"/>
+          <w:sz w:val="21"/>
+        </w:rPr>
+        <w:t xml:space="preserve"> nested beneath the </w:t>
+      </w:r>
+      <w:r>
+        <w:rPr>
+          <w:rFonts w:ascii="Georgia" w:hAnsi="Georgia" w:cs="Georgia"/>
+          <w:b/>
+          <w:i w:val="0"/>
+          <w:color w:val="222222"/>
+          <w:sz w:val="21"/>
+        </w:rPr>
+        <w:t>Old Theater</w:t>
+      </w:r>
+      <w:r>
+        <w:rPr>
+          <w:rFonts w:ascii="Georgia" w:hAnsi="Georgia" w:cs="Georgia"/>
+          <w:b w:val="0"/>
+          <w:i w:val="0"/>
+          <w:color w:val="222222"/>
+          <w:sz w:val="21"/>
+        </w:rPr>
+        <w:t>, singing the whole town into forgetting its missing neighbors.</w:t>
+      </w:r>
+    </w:p>
+    <w:p>
+      <w:pPr>
+        <w:spacing w:after="80"/>
+      </w:pPr>
+      <w:r>
+        <w:rPr>
+          <w:rFonts w:ascii="Georgia" w:hAnsi="Georgia" w:cs="Georgia"/>
+          <w:b w:val="0"/>
+          <w:i w:val="0"/>
+          <w:color w:val="222222"/>
+          <w:sz w:val="21"/>
+        </w:rPr>
+        <w:t>The Guardians stuffed their ears with beeswax, followed the silence to the lair below the stage, and ended the song for good. In the quiet afterward they found the chest bearing Elaria's seven-pointed star: one chest, three relics, and a goddess's thanks. Wraithpine remembers everything now, and keeps its lanterns lit on purpose.</w:t>
+      </w:r>
+    </w:p>
+    <w:p>
+      <w:pPr>
+        <w:keepNext/>
+        <w:spacing w:before="220" w:after="60"/>
+      </w:pPr>
+      <w:r>
+        <w:rPr>
+          <w:rFonts w:ascii="Georgia" w:hAnsi="Georgia" w:cs="Georgia"/>
+          <w:b/>
+          <w:color w:val="A0522D"/>
+          <w:sz w:val="26"/>
+        </w:rPr>
+        <w:t>Gearhaven, the Clockwork City</w:t>
+      </w:r>
+    </w:p>
+    <w:p>
+      <w:pPr>
+        <w:keepNext/>
+        <w:spacing w:before="120" w:after="40"/>
+        <w:jc w:val="center"/>
+      </w:pPr>
+      <w:r>
+        <w:drawing>
+          <wp:inline xmlns:a="http://schemas.openxmlformats.org/drawingml/2006/main" xmlns:pic="http://schemas.openxmlformats.org/drawingml/2006/picture">
+            <wp:extent cx="5120640" cy="2880360"/>
+            <wp:docPr id="10" name="Picture 10"/>
+            <wp:cNvGraphicFramePr>
+              <a:graphicFrameLocks noChangeAspect="1"/>
+            </wp:cNvGraphicFramePr>
+            <a:graphic>
+              <a:graphicData uri="http://schemas.openxmlformats.org/drawingml/2006/picture">
+                <pic:pic>
+                  <pic:nvPicPr>
+                    <pic:cNvPr id="0" name="image.jpg"/>
+                    <pic:cNvPicPr/>
+                  </pic:nvPicPr>
+                  <pic:blipFill>
+                    <a:blip r:embed="rId19"/>
+                    <a:stretch>
+                      <a:fillRect/>
+                    </a:stretch>
+                  </pic:blipFill>
+                  <pic:spPr>
+                    <a:xfrm>
+                      <a:off x="0" y="0"/>
+                      <a:ext cx="5120640" cy="2880360"/>
+                    </a:xfrm>
+                    <a:prstGeom prst="rect"/>
+                  </pic:spPr>
+                </pic:pic>
+              </a:graphicData>
+            </a:graphic>
+          </wp:inline>
+        </w:drawing>
+      </w:r>
+    </w:p>
+    <w:p>
+      <w:pPr>
+        <w:spacing w:after="140"/>
+        <w:jc w:val="center"/>
+      </w:pPr>
+      <w:r>
+        <w:rPr>
+          <w:rFonts w:ascii="Georgia" w:hAnsi="Georgia" w:cs="Georgia"/>
+          <w:i/>
+          <w:color w:val="888888"/>
+          <w:sz w:val="18"/>
+        </w:rPr>
+        <w:t>The eastern gate of Gearhaven, where every arriving traveler is wished steady gears.</w:t>
+      </w:r>
+    </w:p>
+    <w:p>
+      <w:pPr>
+        <w:spacing w:after="80"/>
+      </w:pPr>
+      <w:r>
+        <w:rPr>
+          <w:rFonts w:ascii="Georgia" w:hAnsi="Georgia" w:cs="Georgia"/>
+          <w:b w:val="0"/>
+          <w:i w:val="0"/>
+          <w:color w:val="222222"/>
+          <w:sz w:val="21"/>
+        </w:rPr>
+        <w:t xml:space="preserve">The great city of inventors and the party's home base: brass towers, steam vents, tram lines, and Mechagnome citizens whose eyes flicker when the planes act up. Its heart is the </w:t>
+      </w:r>
+      <w:r>
+        <w:rPr>
+          <w:rFonts w:ascii="Georgia" w:hAnsi="Georgia" w:cs="Georgia"/>
+          <w:b/>
+          <w:i w:val="0"/>
+          <w:color w:val="222222"/>
+          <w:sz w:val="21"/>
+        </w:rPr>
+        <w:t>Artificer's Guild</w:t>
+      </w:r>
+      <w:r>
+        <w:rPr>
+          <w:rFonts w:ascii="Georgia" w:hAnsi="Georgia" w:cs="Georgia"/>
+          <w:b w:val="0"/>
+          <w:i w:val="0"/>
+          <w:color w:val="222222"/>
+          <w:sz w:val="21"/>
+        </w:rPr>
+        <w:t xml:space="preserve">, where Guildmaster Vane (the locksmith) and the silver archivist Quill keep ten years of impossible work: </w:t>
+      </w:r>
+      <w:r>
+        <w:rPr>
+          <w:rFonts w:ascii="Georgia" w:hAnsi="Georgia" w:cs="Georgia"/>
+          <w:b/>
+          <w:i w:val="0"/>
+          <w:color w:val="222222"/>
+          <w:sz w:val="21"/>
+        </w:rPr>
+        <w:t>Vane's Folly</w:t>
+      </w:r>
+      <w:r>
+        <w:rPr>
+          <w:rFonts w:ascii="Georgia" w:hAnsi="Georgia" w:cs="Georgia"/>
+          <w:b w:val="0"/>
+          <w:i w:val="0"/>
+          <w:color w:val="222222"/>
+          <w:sz w:val="21"/>
+        </w:rPr>
+        <w:t xml:space="preserve">, the Rift Portal, finished at last around the Essence Sphere. Beneath the Guild turns the </w:t>
+      </w:r>
+      <w:r>
+        <w:rPr>
+          <w:rFonts w:ascii="Georgia" w:hAnsi="Georgia" w:cs="Georgia"/>
+          <w:b/>
+          <w:i w:val="0"/>
+          <w:color w:val="222222"/>
+          <w:sz w:val="21"/>
+        </w:rPr>
+        <w:t>Great Governor</w:t>
+      </w:r>
+      <w:r>
+        <w:rPr>
+          <w:rFonts w:ascii="Georgia" w:hAnsi="Georgia" w:cs="Georgia"/>
+          <w:b w:val="0"/>
+          <w:i w:val="0"/>
+          <w:color w:val="222222"/>
+          <w:sz w:val="21"/>
+        </w:rPr>
+        <w:t xml:space="preserve">, the engine that makes the city's heartbeat, and above it the </w:t>
+      </w:r>
+      <w:r>
+        <w:rPr>
+          <w:rFonts w:ascii="Georgia" w:hAnsi="Georgia" w:cs="Georgia"/>
+          <w:b/>
+          <w:i w:val="0"/>
+          <w:color w:val="222222"/>
+          <w:sz w:val="21"/>
+        </w:rPr>
+        <w:t>Orrery of Planes</w:t>
+      </w:r>
+      <w:r>
+        <w:rPr>
+          <w:rFonts w:ascii="Georgia" w:hAnsi="Georgia" w:cs="Georgia"/>
+          <w:b w:val="0"/>
+          <w:i w:val="0"/>
+          <w:color w:val="222222"/>
+          <w:sz w:val="21"/>
+        </w:rPr>
+        <w:t xml:space="preserve"> maps every anchor-star in the sky.</w:t>
+      </w:r>
+    </w:p>
+    <w:p>
+      <w:pPr>
+        <w:spacing w:after="80"/>
+      </w:pPr>
+      <w:r>
+        <w:rPr>
+          <w:rFonts w:ascii="Georgia" w:hAnsi="Georgia" w:cs="Georgia"/>
+          <w:b w:val="0"/>
+          <w:i w:val="0"/>
+          <w:color w:val="222222"/>
+          <w:sz w:val="21"/>
+        </w:rPr>
+        <w:t xml:space="preserve">The chronicle's Gearhaven runs from the eastern gate and the Street of Small Wonders to Henna Brasspot's </w:t>
+      </w:r>
+      <w:r>
+        <w:rPr>
+          <w:rFonts w:ascii="Georgia" w:hAnsi="Georgia" w:cs="Georgia"/>
+          <w:b/>
+          <w:i w:val="0"/>
+          <w:color w:val="222222"/>
+          <w:sz w:val="21"/>
+        </w:rPr>
+        <w:t>Gilded Gear</w:t>
+      </w:r>
+      <w:r>
+        <w:rPr>
+          <w:rFonts w:ascii="Georgia" w:hAnsi="Georgia" w:cs="Georgia"/>
+          <w:b w:val="0"/>
+          <w:i w:val="0"/>
+          <w:color w:val="222222"/>
+          <w:sz w:val="21"/>
+        </w:rPr>
+        <w:t xml:space="preserve"> tavern, Cogtooth Market, and down into the </w:t>
+      </w:r>
+      <w:r>
+        <w:rPr>
+          <w:rFonts w:ascii="Georgia" w:hAnsi="Georgia" w:cs="Georgia"/>
+          <w:b/>
+          <w:i w:val="0"/>
+          <w:color w:val="222222"/>
+          <w:sz w:val="21"/>
+        </w:rPr>
+        <w:t>Underworks</w:t>
+      </w:r>
+      <w:r>
+        <w:rPr>
+          <w:rFonts w:ascii="Georgia" w:hAnsi="Georgia" w:cs="Georgia"/>
+          <w:b w:val="0"/>
+          <w:i w:val="0"/>
+          <w:color w:val="222222"/>
+          <w:sz w:val="21"/>
+        </w:rPr>
+        <w:t xml:space="preserve">, where the party fought a rift swarm and rescued the goblin courier Skitch. In the </w:t>
+      </w:r>
+      <w:r>
+        <w:rPr>
+          <w:rFonts w:ascii="Georgia" w:hAnsi="Georgia" w:cs="Georgia"/>
+          <w:b/>
+          <w:i w:val="0"/>
+          <w:color w:val="222222"/>
+          <w:sz w:val="21"/>
+        </w:rPr>
+        <w:t>Verdant Plaza</w:t>
+      </w:r>
+      <w:r>
+        <w:rPr>
+          <w:rFonts w:ascii="Georgia" w:hAnsi="Georgia" w:cs="Georgia"/>
+          <w:b w:val="0"/>
+          <w:i w:val="0"/>
+          <w:color w:val="222222"/>
+          <w:sz w:val="21"/>
+        </w:rPr>
+        <w:t xml:space="preserve">, the city's one green place, they freed the corrupted </w:t>
+      </w:r>
+      <w:r>
+        <w:rPr>
+          <w:rFonts w:ascii="Georgia" w:hAnsi="Georgia" w:cs="Georgia"/>
+          <w:b/>
+          <w:i w:val="0"/>
+          <w:color w:val="222222"/>
+          <w:sz w:val="21"/>
+        </w:rPr>
+        <w:t>Grand Custodian</w:t>
+      </w:r>
+      <w:r>
+        <w:rPr>
+          <w:rFonts w:ascii="Georgia" w:hAnsi="Georgia" w:cs="Georgia"/>
+          <w:b w:val="0"/>
+          <w:i w:val="0"/>
+          <w:color w:val="222222"/>
+          <w:sz w:val="21"/>
+        </w:rPr>
+        <w:t xml:space="preserve"> and laid it gently to rest, proving that a fraying world is saved by mercy, not by force. The city's wounds closed behind them.</w:t>
+      </w:r>
+    </w:p>
+    <w:p>
+      <w:pPr>
+        <w:keepNext/>
+        <w:spacing w:before="220" w:after="60"/>
+      </w:pPr>
+      <w:r>
+        <w:rPr>
+          <w:rFonts w:ascii="Georgia" w:hAnsi="Georgia" w:cs="Georgia"/>
+          <w:b/>
+          <w:color w:val="A0522D"/>
+          <w:sz w:val="26"/>
+        </w:rPr>
+        <w:t>Roads Not Yet Taken</w:t>
+      </w:r>
+    </w:p>
+    <w:p>
+      <w:pPr>
+        <w:spacing w:after="0" w:before="0"/>
+      </w:pPr>
+      <w:r>
+        <w:drawing>
+          <wp:anchor xmlns:a="http://schemas.openxmlformats.org/drawingml/2006/main" behindDoc="0" distT="0" distB="0" distL="114300" distR="0" simplePos="0" locked="0" layoutInCell="1" allowOverlap="1" relativeHeight="2">
+            <wp:simplePos x="0" y="0"/>
+            <wp:positionH relativeFrom="column">
+              <wp:align>right</wp:align>
+            </wp:positionH>
+            <wp:positionV relativeFrom="paragraph">
+              <wp:posOffset>0</wp:posOffset>
+            </wp:positionV>
+            <wp:extent cx="2286000" cy="2286000"/>
+            <wp:effectExtent l="0" t="0" r="0" b="0"/>
+            <wp:wrapSquare wrapText="bothSides"/>
+            <wp:docPr id="11" name="Picture 11"/>
+            <wp:cNvGraphicFramePr/>
+            <a:graphic xmlns:pic="http://schemas.openxmlformats.org/drawingml/2006/picture">
+              <a:graphicData uri="http://schemas.openxmlformats.org/drawingml/2006/picture">
+                <pic:pic>
+                  <pic:nvPicPr>
+                    <pic:cNvPr id="0" name="image.jpg"/>
+                    <pic:cNvPicPr/>
+                  </pic:nvPicPr>
+                  <pic:blipFill>
+                    <a:blip r:embed="rId20"/>
+                    <a:stretch>
+                      <a:fillRect/>
+                    </a:stretch>
+                  </pic:blipFill>
+                  <pic:spPr>
+                    <a:xfrm>
+                      <a:off x="0" y="0"/>
+                      <a:ext cx="2286000" cy="2286000"/>
+                    </a:xfrm>
+                    <a:prstGeom prst="rect"/>
+                  </pic:spPr>
+                </pic:pic>
+              </a:graphicData>
+            </a:graphic>
+          </wp:anchor>
+        </w:drawing>
+      </w:r>
+    </w:p>
+    <w:p>
+      <w:pPr>
+        <w:spacing w:after="80"/>
+      </w:pPr>
+      <w:r>
+        <w:rPr>
+          <w:rFonts w:ascii="Georgia" w:hAnsi="Georgia" w:cs="Georgia"/>
+          <w:b w:val="0"/>
+          <w:i w:val="0"/>
+          <w:color w:val="222222"/>
+          <w:sz w:val="21"/>
+        </w:rPr>
+        <w:t>The map does not end at Gearhaven, and neither will the chronicle. These places are spoken of, dreamed of, or marked in old logbooks, and every one of them is waiting.</w:t>
+      </w:r>
+    </w:p>
+    <w:p>
+      <w:pPr>
+        <w:spacing w:after="80"/>
+      </w:pPr>
+      <w:r>
+        <w:rPr>
+          <w:rFonts w:ascii="Georgia" w:hAnsi="Georgia" w:cs="Georgia"/>
+          <w:b/>
+          <w:i w:val="0"/>
+          <w:color w:val="222222"/>
+          <w:sz w:val="21"/>
+        </w:rPr>
+        <w:t>Bloodthorn Hollow</w:t>
+      </w:r>
+      <w:r>
+        <w:rPr>
+          <w:rFonts w:ascii="Georgia" w:hAnsi="Georgia" w:cs="Georgia"/>
+          <w:b w:val="0"/>
+          <w:i w:val="0"/>
+          <w:color w:val="222222"/>
+          <w:sz w:val="21"/>
+        </w:rPr>
+        <w:t>, called simply the Hollow: the thorn-ringed home of the Bloodfang Clan, where Stabby was born. Word has come by way of the courier Skitch that cracks are opening near the Hollow and the clan blames the artificers. Someone will have to go home and set that right.</w:t>
+      </w:r>
+    </w:p>
+    <w:p>
+      <w:pPr>
+        <w:spacing w:after="80"/>
+      </w:pPr>
+      <w:r>
+        <w:rPr>
+          <w:rFonts w:ascii="Georgia" w:hAnsi="Georgia" w:cs="Georgia"/>
+          <w:b/>
+          <w:i w:val="0"/>
+          <w:color w:val="222222"/>
+          <w:sz w:val="21"/>
+        </w:rPr>
+        <w:t>Glimmerspire and Deepforge Hollow</w:t>
+      </w:r>
+      <w:r>
+        <w:rPr>
+          <w:rFonts w:ascii="Georgia" w:hAnsi="Georgia" w:cs="Georgia"/>
+          <w:b w:val="0"/>
+          <w:i w:val="0"/>
+          <w:color w:val="222222"/>
+          <w:sz w:val="21"/>
+        </w:rPr>
+        <w:t>, far below in the Underdark: the deep-gnome city of forges and the academy where Lilly built her first turret, home of her mother Poots and Master Crafter Droven Sparkwick. Glimmerspire forged the Essence Sphere before the crisis ever began. How they knew it would be needed is a question with a long answer.</w:t>
+      </w:r>
+    </w:p>
+    <w:p>
+      <w:pPr>
+        <w:spacing w:after="80"/>
+      </w:pPr>
+      <w:r>
+        <w:rPr>
+          <w:rFonts w:ascii="Georgia" w:hAnsi="Georgia" w:cs="Georgia"/>
+          <w:b/>
+          <w:i w:val="0"/>
+          <w:color w:val="222222"/>
+          <w:sz w:val="21"/>
+        </w:rPr>
+        <w:t>The Old Shrine in the east</w:t>
+      </w:r>
+      <w:r>
+        <w:rPr>
+          <w:rFonts w:ascii="Georgia" w:hAnsi="Georgia" w:cs="Georgia"/>
+          <w:b w:val="0"/>
+          <w:i w:val="0"/>
+          <w:color w:val="222222"/>
+          <w:sz w:val="21"/>
+        </w:rPr>
+        <w:t xml:space="preserve">: Ash Catchum's last logbook entry reads, "The pattern leads east. Following the dark. To the old shrine." The Circle's elders believe he meant the </w:t>
+      </w:r>
+      <w:r>
+        <w:rPr>
+          <w:rFonts w:ascii="Georgia" w:hAnsi="Georgia" w:cs="Georgia"/>
+          <w:b/>
+          <w:i w:val="0"/>
+          <w:color w:val="222222"/>
+          <w:sz w:val="21"/>
+        </w:rPr>
+        <w:t>Ancient Shrine of the Forgotten Glade</w:t>
+      </w:r>
+      <w:r>
+        <w:rPr>
+          <w:rFonts w:ascii="Georgia" w:hAnsi="Georgia" w:cs="Georgia"/>
+          <w:b w:val="0"/>
+          <w:i w:val="0"/>
+          <w:color w:val="222222"/>
+          <w:sz w:val="21"/>
+        </w:rPr>
+        <w:t>, a hidden temple of Elaria deep in old-growth wood, said to hold secrets of the covenant and of the enchanted potatoes themselves. Ursa's road bends that way, sooner or later.</w:t>
+      </w:r>
+    </w:p>
+    <w:p>
+      <w:pPr>
+        <w:spacing w:after="80"/>
+      </w:pPr>
+      <w:r>
+        <w:rPr>
+          <w:rFonts w:ascii="Georgia" w:hAnsi="Georgia" w:cs="Georgia"/>
+          <w:b/>
+          <w:i w:val="0"/>
+          <w:color w:val="222222"/>
+          <w:sz w:val="21"/>
+        </w:rPr>
+        <w:t>The Crystal Cavern of Crystal Hollow</w:t>
+      </w:r>
+      <w:r>
+        <w:rPr>
+          <w:rFonts w:ascii="Georgia" w:hAnsi="Georgia" w:cs="Georgia"/>
+          <w:b w:val="0"/>
+          <w:i w:val="0"/>
+          <w:color w:val="222222"/>
+          <w:sz w:val="21"/>
+        </w:rPr>
+        <w:t>: deep within the Ravenstone Cliffs, a cavern of luminescent crystals glowing in every color, said to house creatures tied to the elemental forces. Professor Aelwyn's notes mention it often. No Guardian has yet set foot inside.</w:t>
+      </w:r>
+    </w:p>
+    <w:p>
+      <w:pPr>
+        <w:spacing w:after="80"/>
+      </w:pPr>
+      <w:r>
+        <w:rPr>
+          <w:rFonts w:ascii="Georgia" w:hAnsi="Georgia" w:cs="Georgia"/>
+          <w:b/>
+          <w:i w:val="0"/>
+          <w:color w:val="222222"/>
+          <w:sz w:val="21"/>
+        </w:rPr>
+        <w:t>The five rift-worlds</w:t>
+      </w:r>
+      <w:r>
+        <w:rPr>
+          <w:rFonts w:ascii="Georgia" w:hAnsi="Georgia" w:cs="Georgia"/>
+          <w:b w:val="0"/>
+          <w:i w:val="0"/>
+          <w:color w:val="222222"/>
+          <w:sz w:val="21"/>
+        </w:rPr>
+        <w:t xml:space="preserve"> beyond the portal: Terra the earth-plane first, under dimming Antares, then Unda, Ignis, Aer, and last of all Umbra, the plane of Shadow, under a star already dark. Each failing world keeps a corrupted guardian of its own, and each guardian is waiting, whether it knows it or not, to be freed.</w:t>
+      </w:r>
+    </w:p>
+    <w:p>
+      <w:pPr>
+        <w:spacing w:before="200" w:after="200"/>
+        <w:jc w:val="center"/>
+      </w:pPr>
+      <w:r>
+        <w:rPr>
+          <w:rFonts w:ascii="Georgia" w:hAnsi="Georgia" w:cs="Georgia"/>
+          <w:color w:val="B8860B"/>
+          <w:sz w:val="24"/>
+        </w:rPr>
+        <w:t>✦ ✦ ✦</w:t>
+      </w:r>
+    </w:p>
+    <w:p>
+      <w:pPr>
+        <w:pBdr>
+          <w:left w:val="single" w:sz="18" w:space="12" w:color="B8860B"/>
+        </w:pBdr>
+        <w:shd w:val="clear" w:color="auto" w:fill="FBF6EA"/>
+        <w:spacing w:before="30" w:after="70"/>
+        <w:ind w:left="340" w:right="340"/>
+      </w:pPr>
+      <w:r>
+        <w:rPr>
+          <w:rFonts w:ascii="Georgia" w:hAnsi="Georgia" w:cs="Georgia"/>
+          <w:b w:val="0"/>
+          <w:i w:val="0"/>
+          <w:color w:val="222222"/>
+          <w:sz w:val="21"/>
+        </w:rPr>
+        <w:t>Why the gazetteer matters: the sky is going out, one anchor-star at a time, and in one year the Rift Portal opens. Every road on these pages leads, in the end, to a star: one to relight, one to guard, or one to follow east into the dark. Wherever the Guardians go next, they have already walked the first half of the map.</w:t>
       </w:r>
     </w:p>
     <w:sectPr>

</xml_diff>

<commit_message>
Wire final art: S5 (Brynn, open sea, Dutchman deck), S6 (ridge, Maera, Bellshadow, Old Theater), lore gazetteer completes
Co-Authored-By: Claude Opus 4.8 <noreply@anthropic.com>
</commit_message>
<xml_diff>
--- a/frontmatter/lore_primer.docx
+++ b/frontmatter/lore_primer.docx
@@ -2435,6 +2435,11 @@
       </w:r>
     </w:p>
     <w:p>
+      <w:r>
+        <w:br w:type="page"/>
+      </w:r>
+    </w:p>
+    <w:p>
       <w:pPr>
         <w:keepNext/>
         <w:spacing w:before="220" w:after="60"/>
@@ -2463,7 +2468,7 @@
             <wp:positionV relativeFrom="paragraph">
               <wp:posOffset>0</wp:posOffset>
             </wp:positionV>
-            <wp:extent cx="2286000" cy="2286000"/>
+            <wp:extent cx="2194560" cy="2194560"/>
             <wp:effectExtent l="0" t="0" r="0" b="0"/>
             <wp:wrapSquare wrapText="bothSides"/>
             <wp:docPr id="11" name="Picture 11"/>
@@ -2484,7 +2489,7 @@
                   <pic:spPr>
                     <a:xfrm>
                       <a:off x="0" y="0"/>
-                      <a:ext cx="2286000" cy="2286000"/>
+                      <a:ext cx="2194560" cy="2194560"/>
                     </a:xfrm>
                     <a:prstGeom prst="rect"/>
                   </pic:spPr>
@@ -2537,6 +2542,52 @@
     </w:p>
     <w:p>
       <w:pPr>
+        <w:spacing w:after="0" w:before="0"/>
+      </w:pPr>
+      <w:r>
+        <w:drawing>
+          <wp:anchor xmlns:a="http://schemas.openxmlformats.org/drawingml/2006/main" behindDoc="0" distT="0" distB="0" distL="114300" distR="0" simplePos="0" locked="0" layoutInCell="1" allowOverlap="1" relativeHeight="2">
+            <wp:simplePos x="0" y="0"/>
+            <wp:positionH relativeFrom="column">
+              <wp:align>left</wp:align>
+            </wp:positionH>
+            <wp:positionV relativeFrom="paragraph">
+              <wp:posOffset>0</wp:posOffset>
+            </wp:positionV>
+            <wp:extent cx="2194560" cy="2194560"/>
+            <wp:effectExtent l="0" t="0" r="0" b="0"/>
+            <wp:wrapSquare wrapText="bothSides"/>
+            <wp:docPr id="12" name="Picture 12"/>
+            <wp:cNvGraphicFramePr/>
+            <a:graphic xmlns:pic="http://schemas.openxmlformats.org/drawingml/2006/picture">
+              <a:graphicData uri="http://schemas.openxmlformats.org/drawingml/2006/picture">
+                <pic:pic>
+                  <pic:nvPicPr>
+                    <pic:cNvPr id="0" name="image.jpg"/>
+                    <pic:cNvPicPr/>
+                  </pic:nvPicPr>
+                  <pic:blipFill>
+                    <a:blip r:embed="rId21"/>
+                    <a:stretch>
+                      <a:fillRect/>
+                    </a:stretch>
+                  </pic:blipFill>
+                  <pic:spPr>
+                    <a:xfrm>
+                      <a:off x="0" y="0"/>
+                      <a:ext cx="2194560" cy="2194560"/>
+                    </a:xfrm>
+                    <a:prstGeom prst="rect"/>
+                  </pic:spPr>
+                </pic:pic>
+              </a:graphicData>
+            </a:graphic>
+          </wp:anchor>
+        </w:drawing>
+      </w:r>
+    </w:p>
+    <w:p>
+      <w:pPr>
         <w:spacing w:after="80"/>
       </w:pPr>
       <w:r>
@@ -2558,6 +2609,52 @@
           <w:sz w:val="21"/>
         </w:rPr>
         <w:t>, far below in the Underdark: the deep-gnome city of forges and the academy where Lilly built her first turret, home of her mother Poots and Master Crafter Droven Sparkwick. Glimmerspire forged the Essence Sphere before the crisis ever began. How they knew it would be needed is a question with a long answer.</w:t>
+      </w:r>
+    </w:p>
+    <w:p>
+      <w:pPr>
+        <w:spacing w:after="0" w:before="0"/>
+      </w:pPr>
+      <w:r>
+        <w:drawing>
+          <wp:anchor xmlns:a="http://schemas.openxmlformats.org/drawingml/2006/main" behindDoc="0" distT="0" distB="0" distL="114300" distR="0" simplePos="0" locked="0" layoutInCell="1" allowOverlap="1" relativeHeight="2">
+            <wp:simplePos x="0" y="0"/>
+            <wp:positionH relativeFrom="column">
+              <wp:align>right</wp:align>
+            </wp:positionH>
+            <wp:positionV relativeFrom="paragraph">
+              <wp:posOffset>0</wp:posOffset>
+            </wp:positionV>
+            <wp:extent cx="2194560" cy="2194560"/>
+            <wp:effectExtent l="0" t="0" r="0" b="0"/>
+            <wp:wrapSquare wrapText="bothSides"/>
+            <wp:docPr id="13" name="Picture 13"/>
+            <wp:cNvGraphicFramePr/>
+            <a:graphic xmlns:pic="http://schemas.openxmlformats.org/drawingml/2006/picture">
+              <a:graphicData uri="http://schemas.openxmlformats.org/drawingml/2006/picture">
+                <pic:pic>
+                  <pic:nvPicPr>
+                    <pic:cNvPr id="0" name="image.jpg"/>
+                    <pic:cNvPicPr/>
+                  </pic:nvPicPr>
+                  <pic:blipFill>
+                    <a:blip r:embed="rId22"/>
+                    <a:stretch>
+                      <a:fillRect/>
+                    </a:stretch>
+                  </pic:blipFill>
+                  <pic:spPr>
+                    <a:xfrm>
+                      <a:off x="0" y="0"/>
+                      <a:ext cx="2194560" cy="2194560"/>
+                    </a:xfrm>
+                    <a:prstGeom prst="rect"/>
+                  </pic:spPr>
+                </pic:pic>
+              </a:graphicData>
+            </a:graphic>
+          </wp:anchor>
+        </w:drawing>
       </w:r>
     </w:p>
     <w:p>
@@ -2628,6 +2725,52 @@
           <w:sz w:val="21"/>
         </w:rPr>
         <w:t>: deep within the Ravenstone Cliffs, a cavern of luminescent crystals glowing in every color, said to house creatures tied to the elemental forces. Professor Aelwyn's notes mention it often. No Guardian has yet set foot inside.</w:t>
+      </w:r>
+    </w:p>
+    <w:p>
+      <w:pPr>
+        <w:spacing w:after="0" w:before="0"/>
+      </w:pPr>
+      <w:r>
+        <w:drawing>
+          <wp:anchor xmlns:a="http://schemas.openxmlformats.org/drawingml/2006/main" behindDoc="0" distT="0" distB="0" distL="114300" distR="0" simplePos="0" locked="0" layoutInCell="1" allowOverlap="1" relativeHeight="2">
+            <wp:simplePos x="0" y="0"/>
+            <wp:positionH relativeFrom="column">
+              <wp:align>left</wp:align>
+            </wp:positionH>
+            <wp:positionV relativeFrom="paragraph">
+              <wp:posOffset>0</wp:posOffset>
+            </wp:positionV>
+            <wp:extent cx="2194560" cy="2194560"/>
+            <wp:effectExtent l="0" t="0" r="0" b="0"/>
+            <wp:wrapSquare wrapText="bothSides"/>
+            <wp:docPr id="14" name="Picture 14"/>
+            <wp:cNvGraphicFramePr/>
+            <a:graphic xmlns:pic="http://schemas.openxmlformats.org/drawingml/2006/picture">
+              <a:graphicData uri="http://schemas.openxmlformats.org/drawingml/2006/picture">
+                <pic:pic>
+                  <pic:nvPicPr>
+                    <pic:cNvPr id="0" name="image.jpg"/>
+                    <pic:cNvPicPr/>
+                  </pic:nvPicPr>
+                  <pic:blipFill>
+                    <a:blip r:embed="rId23"/>
+                    <a:stretch>
+                      <a:fillRect/>
+                    </a:stretch>
+                  </pic:blipFill>
+                  <pic:spPr>
+                    <a:xfrm>
+                      <a:off x="0" y="0"/>
+                      <a:ext cx="2194560" cy="2194560"/>
+                    </a:xfrm>
+                    <a:prstGeom prst="rect"/>
+                  </pic:spPr>
+                </pic:pic>
+              </a:graphicData>
+            </a:graphic>
+          </wp:anchor>
+        </w:drawing>
       </w:r>
     </w:p>
     <w:p>

</xml_diff>

<commit_message>
Fix stranded whitespace and unclear art (DM review round 2)
- World doc: Havenmoor entry gains the winter-town float; Wraithpine
  page fills with the Old Theater float; Gearhaven opens a fresh page
- Session 4: festival aerial now leads page 1 under the title with the
  recap flowing after; removed the contextless frozen-hollow float
  from the travel encounter table

Co-Authored-By: Claude Opus 4.8 <noreply@anthropic.com>
</commit_message>
<xml_diff>
--- a/frontmatter/lore_primer.docx
+++ b/frontmatter/lore_primer.docx
@@ -1655,6 +1655,52 @@
     </w:p>
     <w:p>
       <w:pPr>
+        <w:spacing w:after="0" w:before="0"/>
+      </w:pPr>
+      <w:r>
+        <w:drawing>
+          <wp:anchor xmlns:a="http://schemas.openxmlformats.org/drawingml/2006/main" behindDoc="0" distT="91440" distB="100584" distL="201600" distR="201600" simplePos="0" locked="0" layoutInCell="1" allowOverlap="0" relativeHeight="2">
+            <wp:simplePos x="0" y="0"/>
+            <wp:positionH relativeFrom="column">
+              <wp:align>right</wp:align>
+            </wp:positionH>
+            <wp:positionV relativeFrom="paragraph">
+              <wp:posOffset>0</wp:posOffset>
+            </wp:positionV>
+            <wp:extent cx="2834640" cy="2834640"/>
+            <wp:effectExtent l="0" t="0" r="0" b="0"/>
+            <wp:wrapSquare wrapText="bothSides"/>
+            <wp:docPr id="7" name="Picture 7"/>
+            <wp:cNvGraphicFramePr/>
+            <a:graphic xmlns:pic="http://schemas.openxmlformats.org/drawingml/2006/picture">
+              <a:graphicData uri="http://schemas.openxmlformats.org/drawingml/2006/picture">
+                <pic:pic>
+                  <pic:nvPicPr>
+                    <pic:cNvPr id="0" name="image.jpg"/>
+                    <pic:cNvPicPr/>
+                  </pic:nvPicPr>
+                  <pic:blipFill>
+                    <a:blip r:embed="rId16"/>
+                    <a:stretch>
+                      <a:fillRect/>
+                    </a:stretch>
+                  </pic:blipFill>
+                  <pic:spPr>
+                    <a:xfrm>
+                      <a:off x="0" y="0"/>
+                      <a:ext cx="2834640" cy="2834640"/>
+                    </a:xfrm>
+                    <a:prstGeom prst="rect"/>
+                  </pic:spPr>
+                </pic:pic>
+              </a:graphicData>
+            </a:graphic>
+          </wp:anchor>
+        </w:drawing>
+      </w:r>
+    </w:p>
+    <w:p>
+      <w:pPr>
         <w:spacing w:after="80"/>
       </w:pPr>
       <w:r>
@@ -1812,8 +1858,8 @@
       <w:r>
         <w:drawing>
           <wp:inline xmlns:a="http://schemas.openxmlformats.org/drawingml/2006/main" xmlns:pic="http://schemas.openxmlformats.org/drawingml/2006/picture">
-            <wp:extent cx="5486400" cy="3654028"/>
-            <wp:docPr id="7" name="Picture 7"/>
+            <wp:extent cx="5669280" cy="3188970"/>
+            <wp:docPr id="8" name="Picture 8"/>
             <wp:cNvGraphicFramePr>
               <a:graphicFrameLocks noChangeAspect="1"/>
             </wp:cNvGraphicFramePr>
@@ -1825,7 +1871,7 @@
                     <pic:cNvPicPr/>
                   </pic:nvPicPr>
                   <pic:blipFill>
-                    <a:blip r:embed="rId16"/>
+                    <a:blip r:embed="rId17"/>
                     <a:stretch>
                       <a:fillRect/>
                     </a:stretch>
@@ -1833,7 +1879,7 @@
                   <pic:spPr>
                     <a:xfrm>
                       <a:off x="0" y="0"/>
-                      <a:ext cx="5486400" cy="3654028"/>
+                      <a:ext cx="5669280" cy="3188970"/>
                     </a:xfrm>
                     <a:prstGeom prst="rect"/>
                   </pic:spPr>
@@ -1891,7 +1937,7 @@
             <wp:extent cx="2834640" cy="2834640"/>
             <wp:effectExtent l="0" t="0" r="0" b="0"/>
             <wp:wrapSquare wrapText="bothSides"/>
-            <wp:docPr id="8" name="Picture 8"/>
+            <wp:docPr id="9" name="Picture 9"/>
             <wp:cNvGraphicFramePr/>
             <a:graphic xmlns:pic="http://schemas.openxmlformats.org/drawingml/2006/picture">
               <a:graphicData uri="http://schemas.openxmlformats.org/drawingml/2006/picture">
@@ -1901,7 +1947,7 @@
                     <pic:cNvPicPr/>
                   </pic:nvPicPr>
                   <pic:blipFill>
-                    <a:blip r:embed="rId17"/>
+                    <a:blip r:embed="rId18"/>
                     <a:stretch>
                       <a:fillRect/>
                     </a:stretch>
@@ -2035,7 +2081,7 @@
         <w:drawing>
           <wp:inline xmlns:a="http://schemas.openxmlformats.org/drawingml/2006/main" xmlns:pic="http://schemas.openxmlformats.org/drawingml/2006/picture">
             <wp:extent cx="5486400" cy="3654028"/>
-            <wp:docPr id="9" name="Picture 9"/>
+            <wp:docPr id="10" name="Picture 10"/>
             <wp:cNvGraphicFramePr>
               <a:graphicFrameLocks noChangeAspect="1"/>
             </wp:cNvGraphicFramePr>
@@ -2047,7 +2093,7 @@
                     <pic:cNvPicPr/>
                   </pic:nvPicPr>
                   <pic:blipFill>
-                    <a:blip r:embed="rId18"/>
+                    <a:blip r:embed="rId19"/>
                     <a:stretch>
                       <a:fillRect/>
                     </a:stretch>
@@ -2198,6 +2244,52 @@
     </w:p>
     <w:p>
       <w:pPr>
+        <w:spacing w:after="0" w:before="0"/>
+      </w:pPr>
+      <w:r>
+        <w:drawing>
+          <wp:anchor xmlns:a="http://schemas.openxmlformats.org/drawingml/2006/main" behindDoc="0" distT="91440" distB="100584" distL="201600" distR="201600" simplePos="0" locked="0" layoutInCell="1" allowOverlap="0" relativeHeight="2">
+            <wp:simplePos x="0" y="0"/>
+            <wp:positionH relativeFrom="column">
+              <wp:align>right</wp:align>
+            </wp:positionH>
+            <wp:positionV relativeFrom="paragraph">
+              <wp:posOffset>0</wp:posOffset>
+            </wp:positionV>
+            <wp:extent cx="2743200" cy="2743200"/>
+            <wp:effectExtent l="0" t="0" r="0" b="0"/>
+            <wp:wrapSquare wrapText="bothSides"/>
+            <wp:docPr id="11" name="Picture 11"/>
+            <wp:cNvGraphicFramePr/>
+            <a:graphic xmlns:pic="http://schemas.openxmlformats.org/drawingml/2006/picture">
+              <a:graphicData uri="http://schemas.openxmlformats.org/drawingml/2006/picture">
+                <pic:pic>
+                  <pic:nvPicPr>
+                    <pic:cNvPr id="0" name="image.jpg"/>
+                    <pic:cNvPicPr/>
+                  </pic:nvPicPr>
+                  <pic:blipFill>
+                    <a:blip r:embed="rId20"/>
+                    <a:stretch>
+                      <a:fillRect/>
+                    </a:stretch>
+                  </pic:blipFill>
+                  <pic:spPr>
+                    <a:xfrm>
+                      <a:off x="0" y="0"/>
+                      <a:ext cx="2743200" cy="2743200"/>
+                    </a:xfrm>
+                    <a:prstGeom prst="rect"/>
+                  </pic:spPr>
+                </pic:pic>
+              </a:graphicData>
+            </a:graphic>
+          </wp:anchor>
+        </w:drawing>
+      </w:r>
+    </w:p>
+    <w:p>
+      <w:pPr>
         <w:spacing w:after="80"/>
       </w:pPr>
       <w:r>
@@ -2208,7 +2300,12 @@
           <w:color w:val="222222"/>
           <w:sz w:val="21"/>
         </w:rPr>
-        <w:t>The Guardians stuffed their ears with beeswax, followed the silence to the lair below the stage, and ended the song for good. In the quiet afterward they found the chest bearing Elaria's seven-pointed star: one chest, three relics, and a goddess's thanks. Wraithpine remembers everything now, and keeps its lanterns lit on purpose.</w:t>
+        <w:t>The Guardians stuffed their ears with beeswax, followed the silence to the lair below the stage, and ended the song for good. In the quiet afterward they found the chest bearing Elaria's seven-pointed star: one chest, three relics, and a goddess's thanks. Wraithpine remembers everything now, and keeps its lanterns lit on purpose. The Old Theater stands empty on its hill, boarded and quiet; the town has not decided what to do with it, and the theater, for its part, is not telling.</w:t>
+      </w:r>
+    </w:p>
+    <w:p>
+      <w:r>
+        <w:br w:type="page"/>
       </w:r>
     </w:p>
     <w:p>
@@ -2236,7 +2333,7 @@
         <w:drawing>
           <wp:inline xmlns:a="http://schemas.openxmlformats.org/drawingml/2006/main" xmlns:pic="http://schemas.openxmlformats.org/drawingml/2006/picture">
             <wp:extent cx="5486400" cy="3657600"/>
-            <wp:docPr id="10" name="Picture 10"/>
+            <wp:docPr id="12" name="Picture 12"/>
             <wp:cNvGraphicFramePr>
               <a:graphicFrameLocks noChangeAspect="1"/>
             </wp:cNvGraphicFramePr>
@@ -2248,7 +2345,7 @@
                     <pic:cNvPicPr/>
                   </pic:nvPicPr>
                   <pic:blipFill>
-                    <a:blip r:embed="rId19"/>
+                    <a:blip r:embed="rId21"/>
                     <a:stretch>
                       <a:fillRect/>
                     </a:stretch>
@@ -2509,7 +2606,7 @@
             <wp:extent cx="2743200" cy="2743200"/>
             <wp:effectExtent l="0" t="0" r="0" b="0"/>
             <wp:wrapSquare wrapText="bothSides"/>
-            <wp:docPr id="11" name="Picture 11"/>
+            <wp:docPr id="13" name="Picture 13"/>
             <wp:cNvGraphicFramePr/>
             <a:graphic xmlns:pic="http://schemas.openxmlformats.org/drawingml/2006/picture">
               <a:graphicData uri="http://schemas.openxmlformats.org/drawingml/2006/picture">
@@ -2519,7 +2616,7 @@
                     <pic:cNvPicPr/>
                   </pic:nvPicPr>
                   <pic:blipFill>
-                    <a:blip r:embed="rId20"/>
+                    <a:blip r:embed="rId22"/>
                     <a:stretch>
                       <a:fillRect/>
                     </a:stretch>
@@ -2613,7 +2710,7 @@
         <w:drawing>
           <wp:inline xmlns:a="http://schemas.openxmlformats.org/drawingml/2006/main" xmlns:pic="http://schemas.openxmlformats.org/drawingml/2006/picture">
             <wp:extent cx="5486400" cy="3654028"/>
-            <wp:docPr id="12" name="Picture 12"/>
+            <wp:docPr id="14" name="Picture 14"/>
             <wp:cNvGraphicFramePr>
               <a:graphicFrameLocks noChangeAspect="1"/>
             </wp:cNvGraphicFramePr>
@@ -2625,7 +2722,7 @@
                     <pic:cNvPicPr/>
                   </pic:nvPicPr>
                   <pic:blipFill>
-                    <a:blip r:embed="rId21"/>
+                    <a:blip r:embed="rId23"/>
                     <a:stretch>
                       <a:fillRect/>
                     </a:stretch>
@@ -2681,7 +2778,7 @@
             <wp:extent cx="2926080" cy="2926080"/>
             <wp:effectExtent l="0" t="0" r="0" b="0"/>
             <wp:wrapSquare wrapText="bothSides"/>
-            <wp:docPr id="13" name="Picture 13"/>
+            <wp:docPr id="15" name="Picture 15"/>
             <wp:cNvGraphicFramePr/>
             <a:graphic xmlns:pic="http://schemas.openxmlformats.org/drawingml/2006/picture">
               <a:graphicData uri="http://schemas.openxmlformats.org/drawingml/2006/picture">
@@ -2691,7 +2788,7 @@
                     <pic:cNvPicPr/>
                   </pic:nvPicPr>
                   <pic:blipFill>
-                    <a:blip r:embed="rId22"/>
+                    <a:blip r:embed="rId24"/>
                     <a:stretch>
                       <a:fillRect/>
                     </a:stretch>
@@ -2797,7 +2894,7 @@
             <wp:extent cx="2468880" cy="2468880"/>
             <wp:effectExtent l="0" t="0" r="0" b="0"/>
             <wp:wrapSquare wrapText="bothSides"/>
-            <wp:docPr id="14" name="Picture 14"/>
+            <wp:docPr id="16" name="Picture 16"/>
             <wp:cNvGraphicFramePr/>
             <a:graphic xmlns:pic="http://schemas.openxmlformats.org/drawingml/2006/picture">
               <a:graphicData uri="http://schemas.openxmlformats.org/drawingml/2006/picture">
@@ -2807,7 +2904,7 @@
                     <pic:cNvPicPr/>
                   </pic:nvPicPr>
                   <pic:blipFill>
-                    <a:blip r:embed="rId23"/>
+                    <a:blip r:embed="rId25"/>
                     <a:stretch>
                       <a:fillRect/>
                     </a:stretch>

</xml_diff>

<commit_message>
Fix stranded gazetteer page: h2 hardbreak property replaces raw pagebreaks
Raw break paragraphs mint blank pages when repagination lands them at
a page boundary; Word's page-break-before property self-suppresses.
h2 now supports {'hardbreak': True} and the lore gazetteer uses it.

Co-Authored-By: Claude Opus 4.8 <noreply@anthropic.com>
</commit_message>
<xml_diff>
--- a/frontmatter/lore_primer.docx
+++ b/frontmatter/lore_primer.docx
@@ -1040,11 +1040,6 @@
       </w:r>
     </w:p>
     <w:p>
-      <w:r>
-        <w:br w:type="page"/>
-      </w:r>
-    </w:p>
-    <w:p>
       <w:pPr>
         <w:keepNext/>
         <w:spacing w:before="220" w:after="60"/>
@@ -1367,13 +1362,9 @@
       </w:r>
     </w:p>
     <w:p>
-      <w:r>
-        <w:br w:type="page"/>
-      </w:r>
-    </w:p>
-    <w:p>
       <w:pPr>
         <w:keepNext/>
+        <w:pageBreakBefore/>
         <w:spacing w:before="220" w:after="60"/>
       </w:pPr>
       <w:r>
@@ -1634,13 +1625,9 @@
       </w:r>
     </w:p>
     <w:p>
-      <w:r>
-        <w:br w:type="page"/>
-      </w:r>
-    </w:p>
-    <w:p>
       <w:pPr>
         <w:keepNext/>
+        <w:pageBreakBefore/>
         <w:spacing w:before="220" w:after="60"/>
       </w:pPr>
       <w:r>
@@ -2515,13 +2502,9 @@
       </w:r>
     </w:p>
     <w:p>
-      <w:r>
-        <w:br w:type="page"/>
-      </w:r>
-    </w:p>
-    <w:p>
       <w:pPr>
         <w:keepNext/>
+        <w:pageBreakBefore/>
         <w:spacing w:before="220" w:after="60"/>
       </w:pPr>
       <w:r>
@@ -2781,13 +2764,9 @@
       </w:r>
     </w:p>
     <w:p>
-      <w:r>
-        <w:br w:type="page"/>
-      </w:r>
-    </w:p>
-    <w:p>
       <w:pPr>
         <w:keepNext/>
+        <w:pageBreakBefore/>
         <w:spacing w:before="220" w:after="60"/>
       </w:pPr>
       <w:r>

</xml_diff>

<commit_message>
World history bible + Lore of Elaria fragment boxes
- lore/world_history.md: the four ages (Weaving, War of Fractures,
  Long Peace, Darkening), peoples, places, and legends as 27 reusable
  fragments, all additive to canon, each tagged for placement
- Engine: ('lore', title, text) deep-blue double-ruled margin-note box
- World doc carries the first four fragments (Sky-Readers, Delvers,
  Raising of Gearhaven, Rift Portal); stranded pages from the reflow
  fixed

Co-Authored-By: Claude Opus 4.8 <noreply@anthropic.com>
</commit_message>
<xml_diff>
--- a/frontmatter/lore_primer.docx
+++ b/frontmatter/lore_primer.docx
@@ -528,6 +528,54 @@
     <w:p>
       <w:pPr>
         <w:keepNext/>
+        <w:spacing w:before="200" w:after="20"/>
+        <w:ind w:left="500" w:right="500"/>
+        <w:pBdr>
+          <w:top w:val="double" w:sz="6" w:space="4" w:color="1F4D78"/>
+        </w:pBdr>
+      </w:pPr>
+      <w:r>
+        <w:rPr>
+          <w:rFonts w:ascii="Georgia" w:hAnsi="Georgia" w:cs="Georgia"/>
+          <w:b/>
+          <w:color w:val="1F4D78"/>
+          <w:sz w:val="16"/>
+        </w:rPr>
+        <w:t xml:space="preserve">✦ LORE OF ELARIA ✦  </w:t>
+      </w:r>
+      <w:r>
+        <w:rPr>
+          <w:rFonts w:ascii="Georgia" w:hAnsi="Georgia" w:cs="Georgia"/>
+          <w:b/>
+          <w:color w:val="1F4D78"/>
+          <w:sz w:val="19"/>
+        </w:rPr>
+        <w:t>The Sky-Readers</w:t>
+      </w:r>
+    </w:p>
+    <w:p>
+      <w:pPr>
+        <w:keepLines/>
+        <w:spacing w:before="20" w:after="200"/>
+        <w:ind w:left="500" w:right="500"/>
+        <w:pBdr>
+          <w:bottom w:val="double" w:sz="6" w:space="4" w:color="1F4D78"/>
+        </w:pBdr>
+      </w:pPr>
+      <w:r>
+        <w:rPr>
+          <w:rFonts w:ascii="Georgia" w:hAnsi="Georgia" w:cs="Georgia"/>
+          <w:b w:val="0"/>
+          <w:i/>
+          <w:color w:val="222222"/>
+          <w:sz w:val="19"/>
+        </w:rPr>
+        <w:t>The Circle of the Eternal Stars was founded by druids who noticed the stars did not wander like the wild things do. Somebody, they reasoned, must be holding them still. The Circle has watched the sky for forty generations, keeping lists of every star by name, which is why they were the first to notice when one of the names went dark.</w:t>
+      </w:r>
+    </w:p>
+    <w:p>
+      <w:pPr>
+        <w:keepNext/>
         <w:spacing w:before="400" w:after="120"/>
         <w:pBdr>
           <w:bottom w:val="single" w:sz="6" w:space="4" w:color="B8860B"/>
@@ -581,7 +629,6 @@
     <w:p>
       <w:pPr>
         <w:keepNext/>
-        <w:pageBreakBefore/>
         <w:spacing w:before="400" w:after="120"/>
         <w:pBdr>
           <w:bottom w:val="single" w:sz="6" w:space="4" w:color="B8860B"/>
@@ -2770,6 +2817,54 @@
     <w:p>
       <w:pPr>
         <w:keepNext/>
+        <w:spacing w:before="200" w:after="20"/>
+        <w:ind w:left="500" w:right="500"/>
+        <w:pBdr>
+          <w:top w:val="double" w:sz="6" w:space="4" w:color="1F4D78"/>
+        </w:pBdr>
+      </w:pPr>
+      <w:r>
+        <w:rPr>
+          <w:rFonts w:ascii="Georgia" w:hAnsi="Georgia" w:cs="Georgia"/>
+          <w:b/>
+          <w:color w:val="1F4D78"/>
+          <w:sz w:val="16"/>
+        </w:rPr>
+        <w:t xml:space="preserve">✦ LORE OF ELARIA ✦  </w:t>
+      </w:r>
+      <w:r>
+        <w:rPr>
+          <w:rFonts w:ascii="Georgia" w:hAnsi="Georgia" w:cs="Georgia"/>
+          <w:b/>
+          <w:color w:val="1F4D78"/>
+          <w:sz w:val="19"/>
+        </w:rPr>
+        <w:t>The Raising of Gearhaven</w:t>
+      </w:r>
+    </w:p>
+    <w:p>
+      <w:pPr>
+        <w:keepLines/>
+        <w:spacing w:before="20" w:after="200"/>
+        <w:ind w:left="500" w:right="500"/>
+        <w:pBdr>
+          <w:bottom w:val="double" w:sz="6" w:space="4" w:color="1F4D78"/>
+        </w:pBdr>
+      </w:pPr>
+      <w:r>
+        <w:rPr>
+          <w:rFonts w:ascii="Georgia" w:hAnsi="Georgia" w:cs="Georgia"/>
+          <w:b w:val="0"/>
+          <w:i/>
+          <w:color w:val="222222"/>
+          <w:sz w:val="19"/>
+        </w:rPr>
+        <w:t>Gearhaven was not built on the mountain; it was built INTO a promise. The Mechagnome founders raised the Grand Custodian first, a gentle giant to hold the city's weight, and only then laid the first street. A city that begins with kindness to its largest citizen, the founders reasoned, will remember kindness to its smallest.</w:t>
+      </w:r>
+    </w:p>
+    <w:p>
+      <w:pPr>
+        <w:keepNext/>
         <w:pageBreakBefore/>
         <w:spacing w:before="220" w:after="60"/>
       </w:pPr>
@@ -2951,8 +3046,51 @@
       </w:r>
     </w:p>
     <w:p>
+      <w:pPr>
+        <w:keepNext/>
+        <w:spacing w:before="200" w:after="20"/>
+        <w:ind w:left="500" w:right="500"/>
+        <w:pBdr>
+          <w:top w:val="double" w:sz="6" w:space="4" w:color="1F4D78"/>
+        </w:pBdr>
+      </w:pPr>
       <w:r>
-        <w:br w:type="page"/>
+        <w:rPr>
+          <w:rFonts w:ascii="Georgia" w:hAnsi="Georgia" w:cs="Georgia"/>
+          <w:b/>
+          <w:color w:val="1F4D78"/>
+          <w:sz w:val="16"/>
+        </w:rPr>
+        <w:t xml:space="preserve">✦ LORE OF ELARIA ✦  </w:t>
+      </w:r>
+      <w:r>
+        <w:rPr>
+          <w:rFonts w:ascii="Georgia" w:hAnsi="Georgia" w:cs="Georgia"/>
+          <w:b/>
+          <w:color w:val="1F4D78"/>
+          <w:sz w:val="19"/>
+        </w:rPr>
+        <w:t>The Delvers</w:t>
+      </w:r>
+    </w:p>
+    <w:p>
+      <w:pPr>
+        <w:keepLines/>
+        <w:spacing w:before="20" w:after="200"/>
+        <w:ind w:left="500" w:right="500"/>
+        <w:pBdr>
+          <w:bottom w:val="double" w:sz="6" w:space="4" w:color="1F4D78"/>
+        </w:pBdr>
+      </w:pPr>
+      <w:r>
+        <w:rPr>
+          <w:rFonts w:ascii="Georgia" w:hAnsi="Georgia" w:cs="Georgia"/>
+          <w:b w:val="0"/>
+          <w:i/>
+          <w:color w:val="222222"/>
+          <w:sz w:val="19"/>
+        </w:rPr>
+        <w:t>The deep gnomes say they were born of the world's own curiosity: stone that wanted to know what stone was. They delved not for gold but for questions, and Deepforge Hollow sits at the bottom of the longest question anyone ever asked.</w:t>
       </w:r>
     </w:p>
     <w:p>
@@ -3140,6 +3278,54 @@
           <w:sz w:val="21"/>
         </w:rPr>
         <w:t xml:space="preserve"> beyond the portal: Terra the earth-plane first, under dimming Antares, then Unda, Ignis, Aer, and last of all Umbra, the plane of Shadow, under a star already dark. Each failing world keeps a corrupted guardian of its own, and each guardian is waiting, whether it knows it or not, to be freed.</w:t>
+      </w:r>
+    </w:p>
+    <w:p>
+      <w:pPr>
+        <w:keepNext/>
+        <w:spacing w:before="200" w:after="20"/>
+        <w:ind w:left="500" w:right="500"/>
+        <w:pBdr>
+          <w:top w:val="double" w:sz="6" w:space="4" w:color="1F4D78"/>
+        </w:pBdr>
+      </w:pPr>
+      <w:r>
+        <w:rPr>
+          <w:rFonts w:ascii="Georgia" w:hAnsi="Georgia" w:cs="Georgia"/>
+          <w:b/>
+          <w:color w:val="1F4D78"/>
+          <w:sz w:val="16"/>
+        </w:rPr>
+        <w:t xml:space="preserve">✦ LORE OF ELARIA ✦  </w:t>
+      </w:r>
+      <w:r>
+        <w:rPr>
+          <w:rFonts w:ascii="Georgia" w:hAnsi="Georgia" w:cs="Georgia"/>
+          <w:b/>
+          <w:color w:val="1F4D78"/>
+          <w:sz w:val="19"/>
+        </w:rPr>
+        <w:t>The Rift Portal</w:t>
+      </w:r>
+    </w:p>
+    <w:p>
+      <w:pPr>
+        <w:keepLines/>
+        <w:spacing w:before="20" w:after="200"/>
+        <w:ind w:left="500" w:right="500"/>
+        <w:pBdr>
+          <w:bottom w:val="double" w:sz="6" w:space="4" w:color="1F4D78"/>
+        </w:pBdr>
+      </w:pPr>
+      <w:r>
+        <w:rPr>
+          <w:rFonts w:ascii="Georgia" w:hAnsi="Georgia" w:cs="Georgia"/>
+          <w:b w:val="0"/>
+          <w:i/>
+          <w:color w:val="222222"/>
+          <w:sz w:val="19"/>
+        </w:rPr>
+        <w:t>Doors between worlds are older than the Darkening; the Weaving was full of them, all closed politely behind the movers when the furniture of creation was arranged. What Guildmaster Vane built in Gearhaven is not a new idea. It is a very old door, rebuilt from memory, waiting for a key shaped like a heart.</w:t>
       </w:r>
     </w:p>
     <w:p>

</xml_diff>

<commit_message>
The sky gains the Nameless, and the last two lit stars begin to flicker
DM rulings 2026-08-18: the Session 7 orrery plate is canon, and it shows
three dark stars, one unlabeled. That star is now the Nameless, crossed off
the Circle's list before living memory, the world it held not saved, and
the reason Achernar exists: the reserve anchor, held back against the
worst, anchoring nothing. Fomalhaut and Aldebaran are flickering and under
attack from Session 8's epilogue on (both at once, which is not how stars
die on their own), so Sessions 9 and 10 are races, not pre-emptive strikes.
Antares is the first name in forty generations written back onto the list.
Canon star map, the lore primer's Star Map page, and Session 8's closing
threads all updated to match; volumes 02 and 10 regenerated.

Co-Authored-By: Claude Fable 5 <noreply@anthropic.com>
</commit_message>
<xml_diff>
--- a/frontmatter/lore_primer.docx
+++ b/frontmatter/lore_primer.docx
@@ -118,7 +118,7 @@
     </w:p>
     <w:p>
       <w:pPr>
-        <w:spacing w:after="140"/>
+        <w:spacing w:after="240"/>
         <w:jc w:val="center"/>
       </w:pPr>
       <w:r>
@@ -292,7 +292,7 @@
           <w:color w:val="222222"/>
           <w:sz w:val="21"/>
         </w:rPr>
-        <w:t>, still burning bright.</w:t>
+        <w:t>, flickering, and under attack.</w:t>
       </w:r>
     </w:p>
     <w:p>
@@ -337,7 +337,7 @@
           <w:color w:val="222222"/>
           <w:sz w:val="21"/>
         </w:rPr>
-        <w:t>, still burning bright.</w:t>
+        <w:t>, flickering, and under attack.</w:t>
       </w:r>
     </w:p>
     <w:p>
@@ -427,7 +427,7 @@
           <w:color w:val="222222"/>
           <w:sz w:val="21"/>
         </w:rPr>
-        <w:t>, dimming.</w:t>
+        <w:t>, two years dimming, and the first name in forty generations ever written back onto the list.</w:t>
       </w:r>
     </w:p>
     <w:p>
@@ -522,7 +522,32 @@
           <w:color w:val="222222"/>
           <w:sz w:val="21"/>
         </w:rPr>
-        <w:t xml:space="preserve"> a reserve anchor, held back against the worst.</w:t>
+        <w:t xml:space="preserve"> the reserve anchor, held back against the worst, anchoring nothing. The Circle keeps it lit and does not say why.</w:t>
+      </w:r>
+    </w:p>
+    <w:p>
+      <w:pPr>
+        <w:spacing w:after="80"/>
+      </w:pPr>
+      <w:r>
+        <w:rPr>
+          <w:rFonts w:ascii="Georgia" w:hAnsi="Georgia" w:cs="Georgia"/>
+          <w:b/>
+          <w:i w:val="0"/>
+          <w:color w:val="222222"/>
+          <w:sz w:val="21"/>
+        </w:rPr>
+        <w:t>And one more, with no label.</w:t>
+      </w:r>
+      <w:r>
+        <w:rPr>
+          <w:rFonts w:ascii="Georgia" w:hAnsi="Georgia" w:cs="Georgia"/>
+          <w:b w:val="0"/>
+          <w:i w:val="0"/>
+          <w:color w:val="222222"/>
+          <w:sz w:val="21"/>
+        </w:rPr>
+        <w:t xml:space="preserve"> A dark star hangs on the Orrery that the Circle does not name, because nobody remembers its name, or the world it held. It was crossed off the list before the oldest living sky-reader was born. It is the reason the reserve exists.</w:t>
       </w:r>
     </w:p>
     <w:p>
@@ -865,6 +890,7 @@
           </w:tcPr>
           <w:p>
             <w:pPr>
+              <w:keepNext/>
               <w:jc w:val="center"/>
             </w:pPr>
             <w:r>
@@ -909,6 +935,7 @@
           </w:tcPr>
           <w:p>
             <w:pPr>
+              <w:keepNext/>
               <w:jc w:val="center"/>
             </w:pPr>
             <w:r>
@@ -953,6 +980,7 @@
           </w:tcPr>
           <w:p>
             <w:pPr>
+              <w:keepNext/>
               <w:jc w:val="center"/>
             </w:pPr>
             <w:r>
@@ -999,6 +1027,7 @@
           </w:tcPr>
           <w:p>
             <w:pPr>
+              <w:ind w:left="160" w:right="160"/>
               <w:jc w:val="center"/>
             </w:pPr>
             <w:r>
@@ -1018,6 +1047,7 @@
           </w:tcPr>
           <w:p>
             <w:pPr>
+              <w:ind w:left="160" w:right="160"/>
               <w:jc w:val="center"/>
             </w:pPr>
             <w:r>
@@ -1037,6 +1067,7 @@
           </w:tcPr>
           <w:p>
             <w:pPr>
+              <w:ind w:left="160" w:right="160"/>
               <w:jc w:val="center"/>
             </w:pPr>
             <w:r>
@@ -2141,7 +2172,7 @@
     </w:p>
     <w:p>
       <w:pPr>
-        <w:spacing w:after="140"/>
+        <w:spacing w:after="240"/>
         <w:jc w:val="center"/>
       </w:pPr>
       <w:r>
@@ -2363,7 +2394,7 @@
     </w:p>
     <w:p>
       <w:pPr>
-        <w:spacing w:after="140"/>
+        <w:spacing w:after="240"/>
         <w:jc w:val="center"/>
       </w:pPr>
       <w:r>
@@ -2611,7 +2642,7 @@
     </w:p>
     <w:p>
       <w:pPr>
-        <w:spacing w:after="140"/>
+        <w:spacing w:after="240"/>
         <w:jc w:val="center"/>
       </w:pPr>
       <w:r>
@@ -3032,7 +3063,7 @@
     </w:p>
     <w:p>
       <w:pPr>
-        <w:spacing w:after="140"/>
+        <w:spacing w:after="240"/>
         <w:jc w:val="center"/>
       </w:pPr>
       <w:r>

</xml_diff>